<commit_message>
Phiếu đánh giá: tách tiêu chí chuyên môn / kỹ năng mềm, ghi nhận chứng chỉ
- Chuyên môn 3 tiêu chí (điều kiện cần), kỹ năng mềm 5 tiêu chí
- Quy tắc ra kết quả riêng từng nhóm, kết quả chung theo nhóm thấp hơn
- Mục ghi nhận 3 chứng chỉ bắt buộc ngoài role-play

Co-Authored-By: Claude Opus 5.5 <noreply@anthropic.com>
Claude-Session: https://claude.ai/code/session_01SSNewMyLPTT7hzjviqMYeR
</commit_message>
<xml_diff>
--- a/sales-eval/Danh-gia-sales-sau-dao-tao.docx
+++ b/sales-eval/Danh-gia-sales-sau-dao-tao.docx
@@ -136,7 +136,25 @@
           <w:sz w:val="21"/>
           <w:szCs w:val="21"/>
         </w:rPr>
-        <w:t xml:space="preserve">Tổ chức ngay sau Buổi 3. Điểm bài kiểm tra lý thuyết chỉ ghi kèm để tham khảo, không quyết định kết quả.</w:t>
+        <w:t xml:space="preserve">Tổ chức ngay sau Buổi 3. Điểm bài kiểm tra lý thuyết và tình trạng chứng chỉ chỉ ghi nhận cho báo cáo sau đào tạo, không quyết định kết quả.</w:t>
+      </w:r>
+    </w:p>
+    <w:p>
+      <w:pPr>
+        <w:pStyle w:val="ListParagraph"/>
+        <w:numPr>
+          <w:ilvl w:val="0"/>
+          <w:numId w:val="2"/>
+        </w:numPr>
+        <w:spacing w:after="40" w:before="0"/>
+      </w:pPr>
+      <w:r>
+        <w:rPr>
+          <w:rFonts w:ascii="Arial" w:cs="Arial" w:eastAsia="Arial" w:hAnsi="Arial"/>
+          <w:sz w:val="21"/>
+          <w:szCs w:val="21"/>
+        </w:rPr>
+        <w:t xml:space="preserve">Chấm 2 nhóm tiêu chí: Chuyên môn (3 tiêu chí) và Kỹ năng mềm (5 tiêu chí). Nghiên cứu khách hàng, đàm phán – chốt deal, follow up sau đàm phán không chấm ở lần này.</w:t>
       </w:r>
     </w:p>
     <w:p>
@@ -172,7 +190,7 @@
           <w:sz w:val="23"/>
           <w:szCs w:val="23"/>
         </w:rPr>
-        <w:t xml:space="preserve">2. Quy trình cho mỗi nhân sự (khoảng 35 phút)</w:t>
+        <w:t xml:space="preserve">2. Quy trình cho mỗi nhân sự (khoảng 40 phút)</w:t>
       </w:r>
     </w:p>
     <w:tbl>
@@ -688,6 +706,104 @@
                 <w:szCs w:val="21"/>
               </w:rPr>
               <w:t xml:space="preserve">Thông báo kết quả, 1–2 điểm mạnh, 1–2 điểm cần cải thiện, kế hoạch tiếp theo.</w:t>
+            </w:r>
+          </w:p>
+        </w:tc>
+      </w:tr>
+      <w:tr>
+        <w:trPr>
+          <w:cantSplit/>
+        </w:trPr>
+        <w:tc>
+          <w:tcPr>
+            <w:tcW w:type="dxa" w:w="1700"/>
+            <w:tcBorders>
+              <w:top w:val="single" w:color="7F8C99" w:sz="4"/>
+              <w:left w:val="single" w:color="7F8C99" w:sz="4"/>
+              <w:bottom w:val="single" w:color="7F8C99" w:sz="4"/>
+              <w:right w:val="single" w:color="7F8C99" w:sz="4"/>
+            </w:tcBorders>
+            <w:tcMar>
+              <w:top w:type="dxa" w:w="60"/>
+              <w:left w:type="dxa" w:w="90"/>
+              <w:bottom w:type="dxa" w:w="60"/>
+              <w:right w:type="dxa" w:w="90"/>
+            </w:tcMar>
+            <w:vAlign w:val="top"/>
+          </w:tcPr>
+          <w:p>
+            <w:pPr>
+              <w:spacing w:after="20" w:before="0"/>
+            </w:pPr>
+            <w:r>
+              <w:rPr>
+                <w:rFonts w:ascii="Arial" w:cs="Arial" w:eastAsia="Arial" w:hAnsi="Arial"/>
+                <w:sz w:val="21"/>
+                <w:szCs w:val="21"/>
+              </w:rPr>
+              <w:t xml:space="preserve">5. Chứng chỉ</w:t>
+            </w:r>
+          </w:p>
+        </w:tc>
+        <w:tc>
+          <w:tcPr>
+            <w:tcW w:type="dxa" w:w="1500"/>
+            <w:tcBorders>
+              <w:top w:val="single" w:color="7F8C99" w:sz="4"/>
+              <w:left w:val="single" w:color="7F8C99" w:sz="4"/>
+              <w:bottom w:val="single" w:color="7F8C99" w:sz="4"/>
+              <w:right w:val="single" w:color="7F8C99" w:sz="4"/>
+            </w:tcBorders>
+            <w:tcMar>
+              <w:top w:type="dxa" w:w="60"/>
+              <w:left w:type="dxa" w:w="90"/>
+              <w:bottom w:type="dxa" w:w="60"/>
+              <w:right w:type="dxa" w:w="90"/>
+            </w:tcMar>
+            <w:vAlign w:val="top"/>
+          </w:tcPr>
+          <w:p>
+            <w:pPr>
+              <w:spacing w:after="20" w:before="0"/>
+            </w:pPr>
+            <w:r>
+              <w:rPr>
+                <w:rFonts w:ascii="Arial" w:cs="Arial" w:eastAsia="Arial" w:hAnsi="Arial"/>
+                <w:sz w:val="21"/>
+                <w:szCs w:val="21"/>
+              </w:rPr>
+              <w:t xml:space="preserve">2 phút</w:t>
+            </w:r>
+          </w:p>
+        </w:tc>
+        <w:tc>
+          <w:tcPr>
+            <w:tcW w:type="dxa" w:w="6706"/>
+            <w:tcBorders>
+              <w:top w:val="single" w:color="7F8C99" w:sz="4"/>
+              <w:left w:val="single" w:color="7F8C99" w:sz="4"/>
+              <w:bottom w:val="single" w:color="7F8C99" w:sz="4"/>
+              <w:right w:val="single" w:color="7F8C99" w:sz="4"/>
+            </w:tcBorders>
+            <w:tcMar>
+              <w:top w:type="dxa" w:w="60"/>
+              <w:left w:type="dxa" w:w="90"/>
+              <w:bottom w:type="dxa" w:w="60"/>
+              <w:right w:type="dxa" w:w="90"/>
+            </w:tcMar>
+            <w:vAlign w:val="top"/>
+          </w:tcPr>
+          <w:p>
+            <w:pPr>
+              <w:spacing w:after="20" w:before="0"/>
+            </w:pPr>
+            <w:r>
+              <w:rPr>
+                <w:rFonts w:ascii="Arial" w:cs="Arial" w:eastAsia="Arial" w:hAnsi="Arial"/>
+                <w:sz w:val="21"/>
+                <w:szCs w:val="21"/>
+              </w:rPr>
+              <w:t xml:space="preserve">Ngoài role-play: hỏi tình trạng 3 chứng chỉ bắt buộc, ghi vào mục cuối Phần C.</w:t>
             </w:r>
           </w:p>
         </w:tc>
@@ -762,7 +878,7 @@
           <w:sz w:val="21"/>
           <w:szCs w:val="21"/>
         </w:rPr>
-        <w:t xml:space="preserve">Để nhân sự chủ động mở đầu: tiêu chí 7 (khai thác nhu cầu) chấm theo việc nhân sự có tự hỏi về trường trước khi trình bày hay không.</w:t>
+        <w:t xml:space="preserve">Để nhân sự chủ động mở đầu: KN2 (đặt câu hỏi) chấm theo việc nhân sự có tự hỏi về trường trước khi trình bày hay không. KN1, KN4 quan sát xuyên suốt buổi.</w:t>
       </w:r>
     </w:p>
     <w:p>
@@ -884,7 +1000,7 @@
                 <w:sz w:val="18"/>
                 <w:szCs w:val="18"/>
               </w:rPr>
-              <w:t xml:space="preserve">   (TC1, TC5)</w:t>
+              <w:t xml:space="preserve">   (CM1, CM3)</w:t>
             </w:r>
           </w:p>
           <w:p>
@@ -1043,7 +1159,7 @@
                 <w:sz w:val="18"/>
                 <w:szCs w:val="18"/>
               </w:rPr>
-              <w:t xml:space="preserve">   (TC2)</w:t>
+              <w:t xml:space="preserve">   (CM1, KN4)</w:t>
             </w:r>
           </w:p>
           <w:p>
@@ -1202,7 +1318,43 @@
                 <w:sz w:val="18"/>
                 <w:szCs w:val="18"/>
               </w:rPr>
-              <w:t xml:space="preserve">   (TC3, TC6)</w:t>
+              <w:t xml:space="preserve">   (CM2, KN5)</w:t>
+            </w:r>
+          </w:p>
+          <w:p>
+            <w:pPr>
+              <w:pStyle w:val="ListParagraph"/>
+              <w:numPr>
+                <w:ilvl w:val="0"/>
+                <w:numId w:val="2"/>
+              </w:numPr>
+              <w:spacing w:after="40" w:before="0"/>
+            </w:pPr>
+            <w:r>
+              <w:rPr>
+                <w:rFonts w:ascii="Arial" w:cs="Arial" w:eastAsia="Arial" w:hAnsi="Arial"/>
+                <w:sz w:val="19"/>
+                <w:szCs w:val="19"/>
+              </w:rPr>
+              <w:t xml:space="preserve">Gói Google Workspace for Education: Education Fundamentals (miễn phí, cấp cho toàn trường), các gói nâng cấp Education Standard, Teaching and Learning Upgrade, Education Plus; license CEU cho thiết bị, T&amp;L cho giáo viên. Giá gói nâng cấp: người chấm điền theo bảng giá hiện hành: ……………………</w:t>
+            </w:r>
+          </w:p>
+          <w:p>
+            <w:pPr>
+              <w:pStyle w:val="ListParagraph"/>
+              <w:numPr>
+                <w:ilvl w:val="0"/>
+                <w:numId w:val="2"/>
+              </w:numPr>
+              <w:spacing w:after="40" w:before="0"/>
+            </w:pPr>
+            <w:r>
+              <w:rPr>
+                <w:rFonts w:ascii="Arial" w:cs="Arial" w:eastAsia="Arial" w:hAnsi="Arial"/>
+                <w:sz w:val="19"/>
+                <w:szCs w:val="19"/>
+              </w:rPr>
+              <w:t xml:space="preserve">AI Education là đối tác ủy quyền của Google: tư vấn, cung cấp license – thiết bị, triển khai và đào tạo theo lộ trình năm 1 – 3.</w:t>
             </w:r>
           </w:p>
           <w:p>
@@ -1415,7 +1567,7 @@
                 <w:sz w:val="18"/>
                 <w:szCs w:val="18"/>
               </w:rPr>
-              <w:t xml:space="preserve">   (TC4, TC6)</w:t>
+              <w:t xml:space="preserve">   (CM1, KN3)</w:t>
             </w:r>
           </w:p>
           <w:p>
@@ -1610,7 +1762,7 @@
                 <w:sz w:val="18"/>
                 <w:szCs w:val="18"/>
               </w:rPr>
-              <w:t xml:space="preserve">   (TC2, TC8)</w:t>
+              <w:t xml:space="preserve">   (KN5, KN4)</w:t>
             </w:r>
           </w:p>
           <w:p>
@@ -1769,7 +1921,7 @@
                 <w:sz w:val="18"/>
                 <w:szCs w:val="18"/>
               </w:rPr>
-              <w:t xml:space="preserve">   (TC5, TC8)</w:t>
+              <w:t xml:space="preserve">   (CM3, KN3)</w:t>
             </w:r>
           </w:p>
           <w:p>
@@ -1928,7 +2080,7 @@
                 <w:sz w:val="18"/>
                 <w:szCs w:val="18"/>
               </w:rPr>
-              <w:t xml:space="preserve">   (TC9)</w:t>
+              <w:t xml:space="preserve">   (KN5, KN2)</w:t>
             </w:r>
           </w:p>
           <w:p>
@@ -2419,7 +2571,7 @@
           <w:sz w:val="21"/>
           <w:szCs w:val="21"/>
         </w:rPr>
-        <w:t xml:space="preserve">Không cộng điểm tổng – một tiêu chí cao không bù cho tiêu chí yếu.</w:t>
+        <w:t xml:space="preserve">Không cộng điểm tổng – một tiêu chí cao không bù cho tiêu chí yếu. Chuyên môn là điều kiện cần nên chấm chặt hơn kỹ năng mềm.</w:t>
       </w:r>
     </w:p>
     <w:tbl>
@@ -2435,23 +2587,57 @@
         </w:tblBorders>
       </w:tblPr>
       <w:tblGrid>
-        <w:gridCol w:w="2600"/>
-        <w:gridCol w:w="7306"/>
+        <w:gridCol w:w="2000"/>
+        <w:gridCol w:w="3953"/>
+        <w:gridCol w:w="3953"/>
       </w:tblGrid>
       <w:tr>
         <w:trPr>
           <w:cantSplit/>
+          <w:tblHeader/>
         </w:trPr>
         <w:tc>
           <w:tcPr>
-            <w:tcW w:type="dxa" w:w="2600"/>
-            <w:tcBorders>
-              <w:top w:val="single" w:color="7F8C99" w:sz="4"/>
-              <w:left w:val="single" w:color="7F8C99" w:sz="4"/>
-              <w:bottom w:val="single" w:color="7F8C99" w:sz="4"/>
-              <w:right w:val="single" w:color="7F8C99" w:sz="4"/>
-            </w:tcBorders>
-            <w:shd w:fill="DCEFD9" w:color="auto" w:val="clear"/>
+            <w:tcW w:type="dxa" w:w="2000"/>
+            <w:tcBorders>
+              <w:top w:val="single" w:color="7F8C99" w:sz="4"/>
+              <w:left w:val="single" w:color="7F8C99" w:sz="4"/>
+              <w:bottom w:val="single" w:color="7F8C99" w:sz="4"/>
+              <w:right w:val="single" w:color="7F8C99" w:sz="4"/>
+            </w:tcBorders>
+            <w:shd w:fill="E8EEF4" w:color="auto" w:val="clear"/>
+            <w:tcMar>
+              <w:top w:type="dxa" w:w="60"/>
+              <w:left w:type="dxa" w:w="90"/>
+              <w:bottom w:type="dxa" w:w="60"/>
+              <w:right w:type="dxa" w:w="90"/>
+            </w:tcMar>
+            <w:vAlign w:val="top"/>
+          </w:tcPr>
+          <w:p>
+            <w:pPr>
+              <w:spacing w:after="20" w:before="0"/>
+            </w:pPr>
+            <w:r>
+              <w:rPr>
+                <w:rFonts w:ascii="Arial" w:cs="Arial" w:eastAsia="Arial" w:hAnsi="Arial"/>
+                <w:sz w:val="21"/>
+                <w:szCs w:val="21"/>
+              </w:rPr>
+              <w:t xml:space="preserve"/>
+            </w:r>
+          </w:p>
+        </w:tc>
+        <w:tc>
+          <w:tcPr>
+            <w:tcW w:type="dxa" w:w="3953"/>
+            <w:tcBorders>
+              <w:top w:val="single" w:color="7F8C99" w:sz="4"/>
+              <w:left w:val="single" w:color="7F8C99" w:sz="4"/>
+              <w:bottom w:val="single" w:color="7F8C99" w:sz="4"/>
+              <w:right w:val="single" w:color="7F8C99" w:sz="4"/>
+            </w:tcBorders>
+            <w:shd w:fill="E8EEF4" w:color="auto" w:val="clear"/>
             <w:tcMar>
               <w:top w:type="dxa" w:w="60"/>
               <w:left w:type="dxa" w:w="90"/>
@@ -2472,38 +2658,41 @@
                 <w:sz w:val="21"/>
                 <w:szCs w:val="21"/>
               </w:rPr>
-              <w:t xml:space="preserve">ĐẠT</w:t>
-            </w:r>
-          </w:p>
-        </w:tc>
-        <w:tc>
-          <w:tcPr>
-            <w:tcW w:type="dxa" w:w="7306"/>
-            <w:tcBorders>
-              <w:top w:val="single" w:color="7F8C99" w:sz="4"/>
-              <w:left w:val="single" w:color="7F8C99" w:sz="4"/>
-              <w:bottom w:val="single" w:color="7F8C99" w:sz="4"/>
-              <w:right w:val="single" w:color="7F8C99" w:sz="4"/>
-            </w:tcBorders>
-            <w:tcMar>
-              <w:top w:type="dxa" w:w="60"/>
-              <w:left w:type="dxa" w:w="90"/>
-              <w:bottom w:type="dxa" w:w="60"/>
-              <w:right w:type="dxa" w:w="90"/>
-            </w:tcMar>
-            <w:vAlign w:val="top"/>
-          </w:tcPr>
-          <w:p>
-            <w:pPr>
-              <w:spacing w:after="20" w:before="0"/>
-            </w:pPr>
-            <w:r>
-              <w:rPr>
-                <w:rFonts w:ascii="Arial" w:cs="Arial" w:eastAsia="Arial" w:hAnsi="Arial"/>
-                <w:sz w:val="21"/>
-                <w:szCs w:val="21"/>
-              </w:rPr>
-              <w:t xml:space="preserve">Cả 9 tiêu chí đều từ 3 trở lên.</w:t>
+              <w:t xml:space="preserve">I. Chuyên môn (3 tiêu chí)</w:t>
+            </w:r>
+          </w:p>
+        </w:tc>
+        <w:tc>
+          <w:tcPr>
+            <w:tcW w:type="dxa" w:w="3953"/>
+            <w:tcBorders>
+              <w:top w:val="single" w:color="7F8C99" w:sz="4"/>
+              <w:left w:val="single" w:color="7F8C99" w:sz="4"/>
+              <w:bottom w:val="single" w:color="7F8C99" w:sz="4"/>
+              <w:right w:val="single" w:color="7F8C99" w:sz="4"/>
+            </w:tcBorders>
+            <w:shd w:fill="E8EEF4" w:color="auto" w:val="clear"/>
+            <w:tcMar>
+              <w:top w:type="dxa" w:w="60"/>
+              <w:left w:type="dxa" w:w="90"/>
+              <w:bottom w:type="dxa" w:w="60"/>
+              <w:right w:type="dxa" w:w="90"/>
+            </w:tcMar>
+            <w:vAlign w:val="top"/>
+          </w:tcPr>
+          <w:p>
+            <w:pPr>
+              <w:spacing w:after="20" w:before="0"/>
+            </w:pPr>
+            <w:r>
+              <w:rPr>
+                <w:rFonts w:ascii="Arial" w:cs="Arial" w:eastAsia="Arial" w:hAnsi="Arial"/>
+                <w:b/>
+                <w:bCs/>
+                <w:sz w:val="21"/>
+                <w:szCs w:val="21"/>
+              </w:rPr>
+              <w:t xml:space="preserve">II. Kỹ năng mềm (5 tiêu chí)</w:t>
             </w:r>
           </w:p>
         </w:tc>
@@ -2514,14 +2703,14 @@
         </w:trPr>
         <w:tc>
           <w:tcPr>
-            <w:tcW w:type="dxa" w:w="2600"/>
-            <w:tcBorders>
-              <w:top w:val="single" w:color="7F8C99" w:sz="4"/>
-              <w:left w:val="single" w:color="7F8C99" w:sz="4"/>
-              <w:bottom w:val="single" w:color="7F8C99" w:sz="4"/>
-              <w:right w:val="single" w:color="7F8C99" w:sz="4"/>
-            </w:tcBorders>
-            <w:shd w:fill="FFF1CC" w:color="auto" w:val="clear"/>
+            <w:tcW w:type="dxa" w:w="2000"/>
+            <w:tcBorders>
+              <w:top w:val="single" w:color="7F8C99" w:sz="4"/>
+              <w:left w:val="single" w:color="7F8C99" w:sz="4"/>
+              <w:bottom w:val="single" w:color="7F8C99" w:sz="4"/>
+              <w:right w:val="single" w:color="7F8C99" w:sz="4"/>
+            </w:tcBorders>
+            <w:shd w:fill="DCEFD9" w:color="auto" w:val="clear"/>
             <w:tcMar>
               <w:top w:type="dxa" w:w="60"/>
               <w:left w:type="dxa" w:w="90"/>
@@ -2542,38 +2731,69 @@
                 <w:sz w:val="21"/>
                 <w:szCs w:val="21"/>
               </w:rPr>
-              <w:t xml:space="preserve">ĐẠT CÓ ĐIỀU KIỆN</w:t>
-            </w:r>
-          </w:p>
-        </w:tc>
-        <w:tc>
-          <w:tcPr>
-            <w:tcW w:type="dxa" w:w="7306"/>
-            <w:tcBorders>
-              <w:top w:val="single" w:color="7F8C99" w:sz="4"/>
-              <w:left w:val="single" w:color="7F8C99" w:sz="4"/>
-              <w:bottom w:val="single" w:color="7F8C99" w:sz="4"/>
-              <w:right w:val="single" w:color="7F8C99" w:sz="4"/>
-            </w:tcBorders>
-            <w:tcMar>
-              <w:top w:type="dxa" w:w="60"/>
-              <w:left w:type="dxa" w:w="90"/>
-              <w:bottom w:type="dxa" w:w="60"/>
-              <w:right w:type="dxa" w:w="90"/>
-            </w:tcMar>
-            <w:vAlign w:val="top"/>
-          </w:tcPr>
-          <w:p>
-            <w:pPr>
-              <w:spacing w:after="20" w:before="0"/>
-            </w:pPr>
-            <w:r>
-              <w:rPr>
-                <w:rFonts w:ascii="Arial" w:cs="Arial" w:eastAsia="Arial" w:hAnsi="Arial"/>
-                <w:sz w:val="21"/>
-                <w:szCs w:val="21"/>
-              </w:rPr>
-              <w:t xml:space="preserve">Không có điểm 1, có 1–2 tiêu chí điểm 2. Teamlead kèm 1 buổi; đánh giá lại trong vòng 1 tuần, chỉ chấm lại các tiêu chí dưới 3.</w:t>
+              <w:t xml:space="preserve">ĐẠT</w:t>
+            </w:r>
+          </w:p>
+        </w:tc>
+        <w:tc>
+          <w:tcPr>
+            <w:tcW w:type="dxa" w:w="3953"/>
+            <w:tcBorders>
+              <w:top w:val="single" w:color="7F8C99" w:sz="4"/>
+              <w:left w:val="single" w:color="7F8C99" w:sz="4"/>
+              <w:bottom w:val="single" w:color="7F8C99" w:sz="4"/>
+              <w:right w:val="single" w:color="7F8C99" w:sz="4"/>
+            </w:tcBorders>
+            <w:tcMar>
+              <w:top w:type="dxa" w:w="60"/>
+              <w:left w:type="dxa" w:w="90"/>
+              <w:bottom w:type="dxa" w:w="60"/>
+              <w:right w:type="dxa" w:w="90"/>
+            </w:tcMar>
+            <w:vAlign w:val="top"/>
+          </w:tcPr>
+          <w:p>
+            <w:pPr>
+              <w:spacing w:after="20" w:before="0"/>
+            </w:pPr>
+            <w:r>
+              <w:rPr>
+                <w:rFonts w:ascii="Arial" w:cs="Arial" w:eastAsia="Arial" w:hAnsi="Arial"/>
+                <w:sz w:val="21"/>
+                <w:szCs w:val="21"/>
+              </w:rPr>
+              <w:t xml:space="preserve">Cả 3 tiêu chí từ 3 trở lên.</w:t>
+            </w:r>
+          </w:p>
+        </w:tc>
+        <w:tc>
+          <w:tcPr>
+            <w:tcW w:type="dxa" w:w="3953"/>
+            <w:tcBorders>
+              <w:top w:val="single" w:color="7F8C99" w:sz="4"/>
+              <w:left w:val="single" w:color="7F8C99" w:sz="4"/>
+              <w:bottom w:val="single" w:color="7F8C99" w:sz="4"/>
+              <w:right w:val="single" w:color="7F8C99" w:sz="4"/>
+            </w:tcBorders>
+            <w:tcMar>
+              <w:top w:type="dxa" w:w="60"/>
+              <w:left w:type="dxa" w:w="90"/>
+              <w:bottom w:type="dxa" w:w="60"/>
+              <w:right w:type="dxa" w:w="90"/>
+            </w:tcMar>
+            <w:vAlign w:val="top"/>
+          </w:tcPr>
+          <w:p>
+            <w:pPr>
+              <w:spacing w:after="20" w:before="0"/>
+            </w:pPr>
+            <w:r>
+              <w:rPr>
+                <w:rFonts w:ascii="Arial" w:cs="Arial" w:eastAsia="Arial" w:hAnsi="Arial"/>
+                <w:sz w:val="21"/>
+                <w:szCs w:val="21"/>
+              </w:rPr>
+              <w:t xml:space="preserve">Không có điểm 1, tối đa 2 tiêu chí điểm 2.</w:t>
             </w:r>
           </w:p>
         </w:tc>
@@ -2584,14 +2804,14 @@
         </w:trPr>
         <w:tc>
           <w:tcPr>
-            <w:tcW w:type="dxa" w:w="2600"/>
-            <w:tcBorders>
-              <w:top w:val="single" w:color="7F8C99" w:sz="4"/>
-              <w:left w:val="single" w:color="7F8C99" w:sz="4"/>
-              <w:bottom w:val="single" w:color="7F8C99" w:sz="4"/>
-              <w:right w:val="single" w:color="7F8C99" w:sz="4"/>
-            </w:tcBorders>
-            <w:shd w:fill="F6D5D5" w:color="auto" w:val="clear"/>
+            <w:tcW w:type="dxa" w:w="2000"/>
+            <w:tcBorders>
+              <w:top w:val="single" w:color="7F8C99" w:sz="4"/>
+              <w:left w:val="single" w:color="7F8C99" w:sz="4"/>
+              <w:bottom w:val="single" w:color="7F8C99" w:sz="4"/>
+              <w:right w:val="single" w:color="7F8C99" w:sz="4"/>
+            </w:tcBorders>
+            <w:shd w:fill="FFF1CC" w:color="auto" w:val="clear"/>
             <w:tcMar>
               <w:top w:type="dxa" w:w="60"/>
               <w:left w:type="dxa" w:w="90"/>
@@ -2612,38 +2832,170 @@
                 <w:sz w:val="21"/>
                 <w:szCs w:val="21"/>
               </w:rPr>
+              <w:t xml:space="preserve">ĐẠT CÓ ĐIỀU KIỆN</w:t>
+            </w:r>
+          </w:p>
+        </w:tc>
+        <w:tc>
+          <w:tcPr>
+            <w:tcW w:type="dxa" w:w="3953"/>
+            <w:tcBorders>
+              <w:top w:val="single" w:color="7F8C99" w:sz="4"/>
+              <w:left w:val="single" w:color="7F8C99" w:sz="4"/>
+              <w:bottom w:val="single" w:color="7F8C99" w:sz="4"/>
+              <w:right w:val="single" w:color="7F8C99" w:sz="4"/>
+            </w:tcBorders>
+            <w:tcMar>
+              <w:top w:type="dxa" w:w="60"/>
+              <w:left w:type="dxa" w:w="90"/>
+              <w:bottom w:type="dxa" w:w="60"/>
+              <w:right w:type="dxa" w:w="90"/>
+            </w:tcMar>
+            <w:vAlign w:val="top"/>
+          </w:tcPr>
+          <w:p>
+            <w:pPr>
+              <w:spacing w:after="20" w:before="0"/>
+            </w:pPr>
+            <w:r>
+              <w:rPr>
+                <w:rFonts w:ascii="Arial" w:cs="Arial" w:eastAsia="Arial" w:hAnsi="Arial"/>
+                <w:sz w:val="21"/>
+                <w:szCs w:val="21"/>
+              </w:rPr>
+              <w:t xml:space="preserve">Không có điểm 1, đúng 1 tiêu chí điểm 2.</w:t>
+            </w:r>
+          </w:p>
+        </w:tc>
+        <w:tc>
+          <w:tcPr>
+            <w:tcW w:type="dxa" w:w="3953"/>
+            <w:tcBorders>
+              <w:top w:val="single" w:color="7F8C99" w:sz="4"/>
+              <w:left w:val="single" w:color="7F8C99" w:sz="4"/>
+              <w:bottom w:val="single" w:color="7F8C99" w:sz="4"/>
+              <w:right w:val="single" w:color="7F8C99" w:sz="4"/>
+            </w:tcBorders>
+            <w:tcMar>
+              <w:top w:type="dxa" w:w="60"/>
+              <w:left w:type="dxa" w:w="90"/>
+              <w:bottom w:type="dxa" w:w="60"/>
+              <w:right w:type="dxa" w:w="90"/>
+            </w:tcMar>
+            <w:vAlign w:val="top"/>
+          </w:tcPr>
+          <w:p>
+            <w:pPr>
+              <w:spacing w:after="20" w:before="0"/>
+            </w:pPr>
+            <w:r>
+              <w:rPr>
+                <w:rFonts w:ascii="Arial" w:cs="Arial" w:eastAsia="Arial" w:hAnsi="Arial"/>
+                <w:sz w:val="21"/>
+                <w:szCs w:val="21"/>
+              </w:rPr>
+              <w:t xml:space="preserve">Không có điểm 1, 3 tiêu chí điểm 2.</w:t>
+            </w:r>
+          </w:p>
+        </w:tc>
+      </w:tr>
+      <w:tr>
+        <w:trPr>
+          <w:cantSplit/>
+        </w:trPr>
+        <w:tc>
+          <w:tcPr>
+            <w:tcW w:type="dxa" w:w="2000"/>
+            <w:tcBorders>
+              <w:top w:val="single" w:color="7F8C99" w:sz="4"/>
+              <w:left w:val="single" w:color="7F8C99" w:sz="4"/>
+              <w:bottom w:val="single" w:color="7F8C99" w:sz="4"/>
+              <w:right w:val="single" w:color="7F8C99" w:sz="4"/>
+            </w:tcBorders>
+            <w:shd w:fill="F6D5D5" w:color="auto" w:val="clear"/>
+            <w:tcMar>
+              <w:top w:type="dxa" w:w="60"/>
+              <w:left w:type="dxa" w:w="90"/>
+              <w:bottom w:type="dxa" w:w="60"/>
+              <w:right w:type="dxa" w:w="90"/>
+            </w:tcMar>
+            <w:vAlign w:val="top"/>
+          </w:tcPr>
+          <w:p>
+            <w:pPr>
+              <w:spacing w:after="20" w:before="0"/>
+            </w:pPr>
+            <w:r>
+              <w:rPr>
+                <w:rFonts w:ascii="Arial" w:cs="Arial" w:eastAsia="Arial" w:hAnsi="Arial"/>
+                <w:b/>
+                <w:bCs/>
+                <w:sz w:val="21"/>
+                <w:szCs w:val="21"/>
+              </w:rPr>
               <w:t xml:space="preserve">CHƯA ĐẠT</w:t>
             </w:r>
           </w:p>
         </w:tc>
         <w:tc>
           <w:tcPr>
-            <w:tcW w:type="dxa" w:w="7306"/>
-            <w:tcBorders>
-              <w:top w:val="single" w:color="7F8C99" w:sz="4"/>
-              <w:left w:val="single" w:color="7F8C99" w:sz="4"/>
-              <w:bottom w:val="single" w:color="7F8C99" w:sz="4"/>
-              <w:right w:val="single" w:color="7F8C99" w:sz="4"/>
-            </w:tcBorders>
-            <w:tcMar>
-              <w:top w:type="dxa" w:w="60"/>
-              <w:left w:type="dxa" w:w="90"/>
-              <w:bottom w:type="dxa" w:w="60"/>
-              <w:right w:type="dxa" w:w="90"/>
-            </w:tcMar>
-            <w:vAlign w:val="top"/>
-          </w:tcPr>
-          <w:p>
-            <w:pPr>
-              <w:spacing w:after="20" w:before="0"/>
-            </w:pPr>
-            <w:r>
-              <w:rPr>
-                <w:rFonts w:ascii="Arial" w:cs="Arial" w:eastAsia="Arial" w:hAnsi="Arial"/>
-                <w:sz w:val="21"/>
-                <w:szCs w:val="21"/>
-              </w:rPr>
-              <w:t xml:space="preserve">Có ít nhất 1 tiêu chí điểm 1, HOẶC từ 3 tiêu chí điểm 2 trở lên, HOẶC mắc Lỗi nghiêm trọng. Đánh giá lại tối đa 1 lần sau 1–2 tuần; nếu vẫn Chưa đạt, Manager quyết định hướng xử lý.</w:t>
+            <w:tcW w:type="dxa" w:w="3953"/>
+            <w:tcBorders>
+              <w:top w:val="single" w:color="7F8C99" w:sz="4"/>
+              <w:left w:val="single" w:color="7F8C99" w:sz="4"/>
+              <w:bottom w:val="single" w:color="7F8C99" w:sz="4"/>
+              <w:right w:val="single" w:color="7F8C99" w:sz="4"/>
+            </w:tcBorders>
+            <w:tcMar>
+              <w:top w:type="dxa" w:w="60"/>
+              <w:left w:type="dxa" w:w="90"/>
+              <w:bottom w:type="dxa" w:w="60"/>
+              <w:right w:type="dxa" w:w="90"/>
+            </w:tcMar>
+            <w:vAlign w:val="top"/>
+          </w:tcPr>
+          <w:p>
+            <w:pPr>
+              <w:spacing w:after="20" w:before="0"/>
+            </w:pPr>
+            <w:r>
+              <w:rPr>
+                <w:rFonts w:ascii="Arial" w:cs="Arial" w:eastAsia="Arial" w:hAnsi="Arial"/>
+                <w:sz w:val="21"/>
+                <w:szCs w:val="21"/>
+              </w:rPr>
+              <w:t xml:space="preserve">Có điểm 1, hoặc từ 2 tiêu chí điểm 2.</w:t>
+            </w:r>
+          </w:p>
+        </w:tc>
+        <w:tc>
+          <w:tcPr>
+            <w:tcW w:type="dxa" w:w="3953"/>
+            <w:tcBorders>
+              <w:top w:val="single" w:color="7F8C99" w:sz="4"/>
+              <w:left w:val="single" w:color="7F8C99" w:sz="4"/>
+              <w:bottom w:val="single" w:color="7F8C99" w:sz="4"/>
+              <w:right w:val="single" w:color="7F8C99" w:sz="4"/>
+            </w:tcBorders>
+            <w:tcMar>
+              <w:top w:type="dxa" w:w="60"/>
+              <w:left w:type="dxa" w:w="90"/>
+              <w:bottom w:type="dxa" w:w="60"/>
+              <w:right w:type="dxa" w:w="90"/>
+            </w:tcMar>
+            <w:vAlign w:val="top"/>
+          </w:tcPr>
+          <w:p>
+            <w:pPr>
+              <w:spacing w:after="20" w:before="0"/>
+            </w:pPr>
+            <w:r>
+              <w:rPr>
+                <w:rFonts w:ascii="Arial" w:cs="Arial" w:eastAsia="Arial" w:hAnsi="Arial"/>
+                <w:sz w:val="21"/>
+                <w:szCs w:val="21"/>
+              </w:rPr>
+              <w:t xml:space="preserve">Có điểm 1, hoặc từ 4 tiêu chí điểm 2.</w:t>
             </w:r>
           </w:p>
         </w:tc>
@@ -2652,6 +3004,29 @@
     <w:p>
       <w:pPr>
         <w:spacing w:after="80" w:before="120"/>
+      </w:pPr>
+      <w:r>
+        <w:rPr>
+          <w:rFonts w:ascii="Arial" w:cs="Arial" w:eastAsia="Arial" w:hAnsi="Arial"/>
+          <w:b/>
+          <w:bCs/>
+          <w:sz w:val="21"/>
+          <w:szCs w:val="21"/>
+        </w:rPr>
+        <w:t xml:space="preserve">Kết quả chung: </w:t>
+      </w:r>
+      <w:r>
+        <w:rPr>
+          <w:rFonts w:ascii="Arial" w:cs="Arial" w:eastAsia="Arial" w:hAnsi="Arial"/>
+          <w:sz w:val="21"/>
+          <w:szCs w:val="21"/>
+        </w:rPr>
+        <w:t xml:space="preserve">lấy theo nhóm có kết quả thấp hơn. Mắc Lỗi nghiêm trọng là CHƯA ĐẠT, bất kể điểm.</w:t>
+      </w:r>
+    </w:p>
+    <w:p>
+      <w:pPr>
+        <w:spacing w:after="80" w:before="40"/>
       </w:pPr>
       <w:r>
         <w:rPr>
@@ -2670,6 +3045,29 @@
           <w:szCs w:val="21"/>
         </w:rPr>
         <w:t xml:space="preserve">báo sai giá hoặc thời hạn hợp đồng; nói sai văn bản pháp lý / nội dung công văn của Sở; hứa điều giải pháp không làm được.</w:t>
+      </w:r>
+    </w:p>
+    <w:p>
+      <w:pPr>
+        <w:spacing w:after="80" w:before="40"/>
+      </w:pPr>
+      <w:r>
+        <w:rPr>
+          <w:rFonts w:ascii="Arial" w:cs="Arial" w:eastAsia="Arial" w:hAnsi="Arial"/>
+          <w:b/>
+          <w:bCs/>
+          <w:sz w:val="21"/>
+          <w:szCs w:val="21"/>
+        </w:rPr>
+        <w:t xml:space="preserve">Sau kết quả: </w:t>
+      </w:r>
+      <w:r>
+        <w:rPr>
+          <w:rFonts w:ascii="Arial" w:cs="Arial" w:eastAsia="Arial" w:hAnsi="Arial"/>
+          <w:sz w:val="21"/>
+          <w:szCs w:val="21"/>
+        </w:rPr>
+        <w:t xml:space="preserve">Đạt có điều kiện – Teamlead kèm 1 buổi, đánh giá lại trong vòng 1 tuần, chỉ chấm lại tiêu chí dưới 3. Chưa đạt – đánh giá lại tối đa 1 lần sau 1–2 tuần; nếu vẫn Chưa đạt, Manager quyết định hướng xử lý.</w:t>
       </w:r>
     </w:p>
     <w:p>
@@ -3552,7 +3950,7 @@
                 <w:sz w:val="21"/>
                 <w:szCs w:val="21"/>
               </w:rPr>
-              <w:t xml:space="preserve">Điểm bài kiểm tra lý thuyết (tham khảo)</w:t>
+              <w:t xml:space="preserve">Điểm bài kiểm tra lý thuyết (ghi nhận)</w:t>
             </w:r>
           </w:p>
         </w:tc>
@@ -3750,9 +4148,9 @@
         </w:tblBorders>
       </w:tblPr>
       <w:tblGrid>
-        <w:gridCol w:w="500"/>
+        <w:gridCol w:w="650"/>
         <w:gridCol w:w="2300"/>
-        <w:gridCol w:w="4106"/>
+        <w:gridCol w:w="3956"/>
         <w:gridCol w:w="1700"/>
         <w:gridCol w:w="1300"/>
       </w:tblGrid>
@@ -3763,7 +4161,7 @@
         </w:trPr>
         <w:tc>
           <w:tcPr>
-            <w:tcW w:type="dxa" w:w="500"/>
+            <w:tcW w:type="dxa" w:w="650"/>
             <w:tcBorders>
               <w:top w:val="single" w:color="7F8C99" w:sz="4"/>
               <w:left w:val="single" w:color="7F8C99" w:sz="4"/>
@@ -3832,7 +4230,7 @@
         </w:tc>
         <w:tc>
           <w:tcPr>
-            <w:tcW w:type="dxa" w:w="4106"/>
+            <w:tcW w:type="dxa" w:w="3956"/>
             <w:tcBorders>
               <w:top w:val="single" w:color="7F8C99" w:sz="4"/>
               <w:left w:val="single" w:color="7F8C99" w:sz="4"/>
@@ -3969,7 +4367,7 @@
                 <w:sz w:val="21"/>
                 <w:szCs w:val="21"/>
               </w:rPr>
-              <w:t xml:space="preserve">Kiến thức giải pháp (Buổi 1 – 2)</w:t>
+              <w:t xml:space="preserve">I. Chuyên môn (điều kiện cần)</w:t>
             </w:r>
           </w:p>
         </w:tc>
@@ -3980,7 +4378,7 @@
         </w:trPr>
         <w:tc>
           <w:tcPr>
-            <w:tcW w:type="dxa" w:w="500"/>
+            <w:tcW w:type="dxa" w:w="650"/>
             <w:tcBorders>
               <w:top w:val="single" w:color="7F8C99" w:sz="4"/>
               <w:left w:val="single" w:color="7F8C99" w:sz="4"/>
@@ -4008,7 +4406,7 @@
                 <w:sz w:val="21"/>
                 <w:szCs w:val="21"/>
               </w:rPr>
-              <w:t xml:space="preserve">1</w:t>
+              <w:t xml:space="preserve">CM1</w:t>
             </w:r>
           </w:p>
         </w:tc>
@@ -4041,13 +4439,13 @@
                 <w:sz w:val="21"/>
                 <w:szCs w:val="21"/>
               </w:rPr>
-              <w:t xml:space="preserve">Trình bày giải pháp</w:t>
-            </w:r>
-          </w:p>
-        </w:tc>
-        <w:tc>
-          <w:tcPr>
-            <w:tcW w:type="dxa" w:w="4106"/>
+              <w:t xml:space="preserve">Hiểu về sản phẩm</w:t>
+            </w:r>
+          </w:p>
+        </w:tc>
+        <w:tc>
+          <w:tcPr>
+            <w:tcW w:type="dxa" w:w="3956"/>
             <w:tcBorders>
               <w:top w:val="single" w:color="7F8C99" w:sz="4"/>
               <w:left w:val="single" w:color="7F8C99" w:sz="4"/>
@@ -4072,7 +4470,7 @@
                 <w:sz w:val="18"/>
                 <w:szCs w:val="18"/>
               </w:rPr>
-              <w:t xml:space="preserve">Nêu đúng Trường học số Google là gì, 3 trụ cột (Hạ tầng số – Nội dung số – Giáo viên số), Google Classroom là trung tâm; AI Education là đối tác ủy quyền chính thức của Google.</w:t>
+              <w:t xml:space="preserve">Nêu đúng Trường học số Google là gì, 3 trụ cột, lợi ích cho nhà trường – giáo viên – học sinh kèm dẫn chứng; dẫn đúng cơ sở pháp lý và chỉ ra giải pháp giúp trường đáp ứng Bộ tiêu chuẩn Trường học số.</w:t>
             </w:r>
           </w:p>
         </w:tc>
@@ -4146,7 +4544,7 @@
         </w:trPr>
         <w:tc>
           <w:tcPr>
-            <w:tcW w:type="dxa" w:w="500"/>
+            <w:tcW w:type="dxa" w:w="650"/>
             <w:tcBorders>
               <w:top w:val="single" w:color="7F8C99" w:sz="4"/>
               <w:left w:val="single" w:color="7F8C99" w:sz="4"/>
@@ -4174,7 +4572,7 @@
                 <w:sz w:val="21"/>
                 <w:szCs w:val="21"/>
               </w:rPr>
-              <w:t xml:space="preserve">2</w:t>
+              <w:t xml:space="preserve">CM2</w:t>
             </w:r>
           </w:p>
         </w:tc>
@@ -4207,13 +4605,13 @@
                 <w:sz w:val="21"/>
                 <w:szCs w:val="21"/>
               </w:rPr>
-              <w:t xml:space="preserve">Lợi ích theo đối tượng</w:t>
-            </w:r>
-          </w:p>
-        </w:tc>
-        <w:tc>
-          <w:tcPr>
-            <w:tcW w:type="dxa" w:w="4106"/>
+              <w:t xml:space="preserve">Hiểu cách phân phối sản phẩm hệ thống Google Workspace</w:t>
+            </w:r>
+          </w:p>
+        </w:tc>
+        <w:tc>
+          <w:tcPr>
+            <w:tcW w:type="dxa" w:w="3956"/>
             <w:tcBorders>
               <w:top w:val="single" w:color="7F8C99" w:sz="4"/>
               <w:left w:val="single" w:color="7F8C99" w:sz="4"/>
@@ -4238,7 +4636,7 @@
                 <w:sz w:val="18"/>
                 <w:szCs w:val="18"/>
               </w:rPr>
-              <w:t xml:space="preserve">Nói đúng lợi ích cho nhà trường, giáo viên, học sinh (và phụ huynh) kèm dẫn chứng: tiết kiệm đến 5 giờ/tuần, 86% giáo viên đánh giá tích cực, Experience AI, Read Along.</w:t>
+              <w:t xml:space="preserve">Nắm các gói Google Workspace for Education và license CEU / T&amp;L; vai trò AI Education là đối tác ủy quyền; đưa ra phương án thiết bị (mua / ChromeOS Flex / thuê) phù hợp và báo đúng giá, thời hạn.</w:t>
             </w:r>
           </w:p>
         </w:tc>
@@ -4312,7 +4710,7 @@
         </w:trPr>
         <w:tc>
           <w:tcPr>
-            <w:tcW w:type="dxa" w:w="500"/>
+            <w:tcW w:type="dxa" w:w="650"/>
             <w:tcBorders>
               <w:top w:val="single" w:color="7F8C99" w:sz="4"/>
               <w:left w:val="single" w:color="7F8C99" w:sz="4"/>
@@ -4340,7 +4738,7 @@
                 <w:sz w:val="21"/>
                 <w:szCs w:val="21"/>
               </w:rPr>
-              <w:t xml:space="preserve">3</w:t>
+              <w:t xml:space="preserve">CM3</w:t>
             </w:r>
           </w:p>
         </w:tc>
@@ -4373,13 +4771,13 @@
                 <w:sz w:val="21"/>
                 <w:szCs w:val="21"/>
               </w:rPr>
-              <w:t xml:space="preserve">Phương án thiết bị &amp; chi phí</w:t>
-            </w:r>
-          </w:p>
-        </w:tc>
-        <w:tc>
-          <w:tcPr>
-            <w:tcW w:type="dxa" w:w="4106"/>
+              <w:t xml:space="preserve">Hiểu kỹ thuật tính năng sản phẩm</w:t>
+            </w:r>
+          </w:p>
+        </w:tc>
+        <w:tc>
+          <w:tcPr>
+            <w:tcW w:type="dxa" w:w="3956"/>
             <w:tcBorders>
               <w:top w:val="single" w:color="7F8C99" w:sz="4"/>
               <w:left w:val="single" w:color="7F8C99" w:sz="4"/>
@@ -4404,7 +4802,7 @@
                 <w:sz w:val="18"/>
                 <w:szCs w:val="18"/>
               </w:rPr>
-              <w:t xml:space="preserve">Đưa ra phương án phù hợp phòng máy cũ (ChromeOS Flex / thuê / mua mới), báo đúng giá và thời hạn CEU, gói thuê, Experience AI.</w:t>
+              <w:t xml:space="preserve">Giải thích đúng cách hoạt động: Google Classroom, Class tools (chế độ tập trung, phụ đề – dịch), hai lớp bảo vệ, Locked Mode, Gemini / LearnLM, quản lý thiết bị bằng CEU; phân biệt với lớp học thông minh.</w:t>
             </w:r>
           </w:p>
         </w:tc>
@@ -4478,25 +4876,26 @@
         </w:trPr>
         <w:tc>
           <w:tcPr>
-            <w:tcW w:type="dxa" w:w="500"/>
-            <w:tcBorders>
-              <w:top w:val="single" w:color="7F8C99" w:sz="4"/>
-              <w:left w:val="single" w:color="7F8C99" w:sz="4"/>
-              <w:bottom w:val="single" w:color="7F8C99" w:sz="4"/>
-              <w:right w:val="single" w:color="7F8C99" w:sz="4"/>
-            </w:tcBorders>
-            <w:tcMar>
-              <w:top w:type="dxa" w:w="60"/>
-              <w:left w:type="dxa" w:w="90"/>
-              <w:bottom w:type="dxa" w:w="60"/>
-              <w:right w:type="dxa" w:w="90"/>
-            </w:tcMar>
-            <w:vAlign w:val="top"/>
-          </w:tcPr>
-          <w:p>
-            <w:pPr>
-              <w:spacing w:after="20" w:before="0"/>
-              <w:jc w:val="center"/>
+            <w:tcW w:type="dxa" w:w="9906"/>
+            <w:gridSpan w:val="5"/>
+            <w:tcBorders>
+              <w:top w:val="single" w:color="7F8C99" w:sz="4"/>
+              <w:left w:val="single" w:color="7F8C99" w:sz="4"/>
+              <w:bottom w:val="single" w:color="7F8C99" w:sz="4"/>
+              <w:right w:val="single" w:color="7F8C99" w:sz="4"/>
+            </w:tcBorders>
+            <w:shd w:fill="D5E2EF" w:color="auto" w:val="clear"/>
+            <w:tcMar>
+              <w:top w:type="dxa" w:w="60"/>
+              <w:left w:type="dxa" w:w="90"/>
+              <w:bottom w:type="dxa" w:w="60"/>
+              <w:right w:type="dxa" w:w="90"/>
+            </w:tcMar>
+            <w:vAlign w:val="top"/>
+          </w:tcPr>
+          <w:p>
+            <w:pPr>
+              <w:spacing w:after="20" w:before="0"/>
             </w:pPr>
             <w:r>
               <w:rPr>
@@ -4506,134 +4905,7 @@
                 <w:sz w:val="21"/>
                 <w:szCs w:val="21"/>
               </w:rPr>
-              <w:t xml:space="preserve">4</w:t>
-            </w:r>
-          </w:p>
-        </w:tc>
-        <w:tc>
-          <w:tcPr>
-            <w:tcW w:type="dxa" w:w="2300"/>
-            <w:tcBorders>
-              <w:top w:val="single" w:color="7F8C99" w:sz="4"/>
-              <w:left w:val="single" w:color="7F8C99" w:sz="4"/>
-              <w:bottom w:val="single" w:color="7F8C99" w:sz="4"/>
-              <w:right w:val="single" w:color="7F8C99" w:sz="4"/>
-            </w:tcBorders>
-            <w:tcMar>
-              <w:top w:type="dxa" w:w="60"/>
-              <w:left w:type="dxa" w:w="90"/>
-              <w:bottom w:type="dxa" w:w="60"/>
-              <w:right w:type="dxa" w:w="90"/>
-            </w:tcMar>
-            <w:vAlign w:val="top"/>
-          </w:tcPr>
-          <w:p>
-            <w:pPr>
-              <w:spacing w:after="20" w:before="0"/>
-            </w:pPr>
-            <w:r>
-              <w:rPr>
-                <w:rFonts w:ascii="Arial" w:cs="Arial" w:eastAsia="Arial" w:hAnsi="Arial"/>
-                <w:b/>
-                <w:bCs/>
-                <w:sz w:val="21"/>
-                <w:szCs w:val="21"/>
-              </w:rPr>
-              <w:t xml:space="preserve">Cơ sở pháp lý &amp; Bộ tiêu chuẩn THS</w:t>
-            </w:r>
-          </w:p>
-        </w:tc>
-        <w:tc>
-          <w:tcPr>
-            <w:tcW w:type="dxa" w:w="4106"/>
-            <w:tcBorders>
-              <w:top w:val="single" w:color="7F8C99" w:sz="4"/>
-              <w:left w:val="single" w:color="7F8C99" w:sz="4"/>
-              <w:bottom w:val="single" w:color="7F8C99" w:sz="4"/>
-              <w:right w:val="single" w:color="7F8C99" w:sz="4"/>
-            </w:tcBorders>
-            <w:tcMar>
-              <w:top w:type="dxa" w:w="60"/>
-              <w:left w:type="dxa" w:w="90"/>
-              <w:bottom w:type="dxa" w:w="60"/>
-              <w:right w:type="dxa" w:w="90"/>
-            </w:tcMar>
-            <w:vAlign w:val="top"/>
-          </w:tcPr>
-          <w:p>
-            <w:pPr>
-              <w:spacing w:after="20" w:before="0"/>
-            </w:pPr>
-            <w:r>
-              <w:rPr>
-                <w:rFonts w:ascii="Arial" w:cs="Arial" w:eastAsia="Arial" w:hAnsi="Arial"/>
-                <w:sz w:val="18"/>
-                <w:szCs w:val="18"/>
-              </w:rPr>
-              <w:t xml:space="preserve">Dẫn đúng văn bản (NQ 71, TT 02/2025, CV 3456, CV 1567, công văn phúc đáp của Sở) và chỉ ra giải pháp giúp trường đáp ứng Bộ tiêu chuẩn Trường học số.</w:t>
-            </w:r>
-          </w:p>
-        </w:tc>
-        <w:tc>
-          <w:tcPr>
-            <w:tcW w:type="dxa" w:w="1700"/>
-            <w:tcBorders>
-              <w:top w:val="single" w:color="7F8C99" w:sz="4"/>
-              <w:left w:val="single" w:color="7F8C99" w:sz="4"/>
-              <w:bottom w:val="single" w:color="7F8C99" w:sz="4"/>
-              <w:right w:val="single" w:color="7F8C99" w:sz="4"/>
-            </w:tcBorders>
-            <w:tcMar>
-              <w:top w:type="dxa" w:w="60"/>
-              <w:left w:type="dxa" w:w="90"/>
-              <w:bottom w:type="dxa" w:w="60"/>
-              <w:right w:type="dxa" w:w="90"/>
-            </w:tcMar>
-            <w:vAlign w:val="center"/>
-          </w:tcPr>
-          <w:p>
-            <w:pPr>
-              <w:spacing w:after="0" w:before="0"/>
-              <w:jc w:val="center"/>
-            </w:pPr>
-            <w:r>
-              <w:rPr>
-                <w:rFonts w:ascii="Arial" w:cs="Arial" w:eastAsia="Arial" w:hAnsi="Arial"/>
-                <w:sz w:val="20"/>
-                <w:szCs w:val="20"/>
-              </w:rPr>
-              <w:t xml:space="preserve">☐1  ☐2  ☐3  ☐4</w:t>
-            </w:r>
-          </w:p>
-        </w:tc>
-        <w:tc>
-          <w:tcPr>
-            <w:tcW w:type="dxa" w:w="1300"/>
-            <w:tcBorders>
-              <w:top w:val="single" w:color="7F8C99" w:sz="4"/>
-              <w:left w:val="single" w:color="7F8C99" w:sz="4"/>
-              <w:bottom w:val="single" w:color="7F8C99" w:sz="4"/>
-              <w:right w:val="single" w:color="7F8C99" w:sz="4"/>
-            </w:tcBorders>
-            <w:tcMar>
-              <w:top w:type="dxa" w:w="60"/>
-              <w:left w:type="dxa" w:w="90"/>
-              <w:bottom w:type="dxa" w:w="60"/>
-              <w:right w:type="dxa" w:w="90"/>
-            </w:tcMar>
-            <w:vAlign w:val="top"/>
-          </w:tcPr>
-          <w:p>
-            <w:pPr>
-              <w:spacing w:after="20" w:before="0"/>
-            </w:pPr>
-            <w:r>
-              <w:rPr>
-                <w:rFonts w:ascii="Arial" w:cs="Arial" w:eastAsia="Arial" w:hAnsi="Arial"/>
-                <w:sz w:val="21"/>
-                <w:szCs w:val="21"/>
-              </w:rPr>
-              <w:t xml:space="preserve"/>
+              <w:t xml:space="preserve">II. Kỹ năng mềm</w:t>
             </w:r>
           </w:p>
         </w:tc>
@@ -4644,7 +4916,7 @@
         </w:trPr>
         <w:tc>
           <w:tcPr>
-            <w:tcW w:type="dxa" w:w="500"/>
+            <w:tcW w:type="dxa" w:w="650"/>
             <w:tcBorders>
               <w:top w:val="single" w:color="7F8C99" w:sz="4"/>
               <w:left w:val="single" w:color="7F8C99" w:sz="4"/>
@@ -4672,7 +4944,7 @@
                 <w:sz w:val="21"/>
                 <w:szCs w:val="21"/>
               </w:rPr>
-              <w:t xml:space="preserve">5</w:t>
+              <w:t xml:space="preserve">KN1</w:t>
             </w:r>
           </w:p>
         </w:tc>
@@ -4705,13 +4977,13 @@
                 <w:sz w:val="21"/>
                 <w:szCs w:val="21"/>
               </w:rPr>
-              <w:t xml:space="preserve">Trải nghiệm tiết học số</w:t>
-            </w:r>
-          </w:p>
-        </w:tc>
-        <w:tc>
-          <w:tcPr>
-            <w:tcW w:type="dxa" w:w="4106"/>
+              <w:t xml:space="preserve">Tư vấn, trình bày, giao tiếp, thuyết trình</w:t>
+            </w:r>
+          </w:p>
+        </w:tc>
+        <w:tc>
+          <w:tcPr>
+            <w:tcW w:type="dxa" w:w="3956"/>
             <w:tcBorders>
               <w:top w:val="single" w:color="7F8C99" w:sz="4"/>
               <w:left w:val="single" w:color="7F8C99" w:sz="4"/>
@@ -4736,7 +5008,7 @@
                 <w:sz w:val="18"/>
                 <w:szCs w:val="18"/>
               </w:rPr>
-              <w:t xml:space="preserve">Mô tả được một tiết học số: mỗi HS 1 thiết bị, Class tools, chế độ tập trung, hai lớp bảo vệ; phân biệt rõ với lớp học thông minh / bảng tương tác.</w:t>
+              <w:t xml:space="preserve">Trình bày mạch lạc, ngắn gọn, dùng ngôn ngữ phù hợp với Hiệu trưởng; không đọc thuộc lòng; gắn từng ý với hoàn cảnh của trường.</w:t>
             </w:r>
           </w:p>
         </w:tc>
@@ -4810,7 +5082,7 @@
         </w:trPr>
         <w:tc>
           <w:tcPr>
-            <w:tcW w:type="dxa" w:w="500"/>
+            <w:tcW w:type="dxa" w:w="650"/>
             <w:tcBorders>
               <w:top w:val="single" w:color="7F8C99" w:sz="4"/>
               <w:left w:val="single" w:color="7F8C99" w:sz="4"/>
@@ -4838,7 +5110,7 @@
                 <w:sz w:val="21"/>
                 <w:szCs w:val="21"/>
               </w:rPr>
-              <w:t xml:space="preserve">6</w:t>
+              <w:t xml:space="preserve">KN2</w:t>
             </w:r>
           </w:p>
         </w:tc>
@@ -4871,13 +5143,13 @@
                 <w:sz w:val="21"/>
                 <w:szCs w:val="21"/>
               </w:rPr>
-              <w:t xml:space="preserve">Độ chính xác</w:t>
-            </w:r>
-          </w:p>
-        </w:tc>
-        <w:tc>
-          <w:tcPr>
-            <w:tcW w:type="dxa" w:w="4106"/>
+              <w:t xml:space="preserve">Đặt câu hỏi</w:t>
+            </w:r>
+          </w:p>
+        </w:tc>
+        <w:tc>
+          <w:tcPr>
+            <w:tcW w:type="dxa" w:w="3956"/>
             <w:tcBorders>
               <w:top w:val="single" w:color="7F8C99" w:sz="4"/>
               <w:left w:val="single" w:color="7F8C99" w:sz="4"/>
@@ -4902,7 +5174,7 @@
                 <w:sz w:val="18"/>
                 <w:szCs w:val="18"/>
               </w:rPr>
-              <w:t xml:space="preserve">Không nói sai số liệu, giá, tên văn bản; không hứa điều giải pháp không làm được. Điểm 1 ở tiêu chí này = Lỗi nghiêm trọng.</w:t>
+              <w:t xml:space="preserve">Chủ động hỏi hiện trạng, mục tiêu, khó khăn của trường trước khi trình bày; dùng câu hỏi mở; hỏi lại để hiểu đúng băn khoăn trước khi trả lời.</w:t>
             </w:r>
           </w:p>
         </w:tc>
@@ -4976,26 +5248,25 @@
         </w:trPr>
         <w:tc>
           <w:tcPr>
-            <w:tcW w:type="dxa" w:w="9906"/>
-            <w:gridSpan w:val="5"/>
-            <w:tcBorders>
-              <w:top w:val="single" w:color="7F8C99" w:sz="4"/>
-              <w:left w:val="single" w:color="7F8C99" w:sz="4"/>
-              <w:bottom w:val="single" w:color="7F8C99" w:sz="4"/>
-              <w:right w:val="single" w:color="7F8C99" w:sz="4"/>
-            </w:tcBorders>
-            <w:shd w:fill="D5E2EF" w:color="auto" w:val="clear"/>
-            <w:tcMar>
-              <w:top w:type="dxa" w:w="60"/>
-              <w:left w:type="dxa" w:w="90"/>
-              <w:bottom w:type="dxa" w:w="60"/>
-              <w:right w:type="dxa" w:w="90"/>
-            </w:tcMar>
-            <w:vAlign w:val="top"/>
-          </w:tcPr>
-          <w:p>
-            <w:pPr>
-              <w:spacing w:after="20" w:before="0"/>
+            <w:tcW w:type="dxa" w:w="650"/>
+            <w:tcBorders>
+              <w:top w:val="single" w:color="7F8C99" w:sz="4"/>
+              <w:left w:val="single" w:color="7F8C99" w:sz="4"/>
+              <w:bottom w:val="single" w:color="7F8C99" w:sz="4"/>
+              <w:right w:val="single" w:color="7F8C99" w:sz="4"/>
+            </w:tcBorders>
+            <w:tcMar>
+              <w:top w:type="dxa" w:w="60"/>
+              <w:left w:type="dxa" w:w="90"/>
+              <w:bottom w:type="dxa" w:w="60"/>
+              <w:right w:type="dxa" w:w="90"/>
+            </w:tcMar>
+            <w:vAlign w:val="top"/>
+          </w:tcPr>
+          <w:p>
+            <w:pPr>
+              <w:spacing w:after="20" w:before="0"/>
+              <w:jc w:val="center"/>
             </w:pPr>
             <w:r>
               <w:rPr>
@@ -5005,7 +5276,134 @@
                 <w:sz w:val="21"/>
                 <w:szCs w:val="21"/>
               </w:rPr>
-              <w:t xml:space="preserve">Kỹ năng bán (Buổi 3)</w:t>
+              <w:t xml:space="preserve">KN3</w:t>
+            </w:r>
+          </w:p>
+        </w:tc>
+        <w:tc>
+          <w:tcPr>
+            <w:tcW w:type="dxa" w:w="2300"/>
+            <w:tcBorders>
+              <w:top w:val="single" w:color="7F8C99" w:sz="4"/>
+              <w:left w:val="single" w:color="7F8C99" w:sz="4"/>
+              <w:bottom w:val="single" w:color="7F8C99" w:sz="4"/>
+              <w:right w:val="single" w:color="7F8C99" w:sz="4"/>
+            </w:tcBorders>
+            <w:tcMar>
+              <w:top w:type="dxa" w:w="60"/>
+              <w:left w:type="dxa" w:w="90"/>
+              <w:bottom w:type="dxa" w:w="60"/>
+              <w:right w:type="dxa" w:w="90"/>
+            </w:tcMar>
+            <w:vAlign w:val="top"/>
+          </w:tcPr>
+          <w:p>
+            <w:pPr>
+              <w:spacing w:after="20" w:before="0"/>
+            </w:pPr>
+            <w:r>
+              <w:rPr>
+                <w:rFonts w:ascii="Arial" w:cs="Arial" w:eastAsia="Arial" w:hAnsi="Arial"/>
+                <w:b/>
+                <w:bCs/>
+                <w:sz w:val="21"/>
+                <w:szCs w:val="21"/>
+              </w:rPr>
+              <w:t xml:space="preserve">Xây dựng niềm tin</w:t>
+            </w:r>
+          </w:p>
+        </w:tc>
+        <w:tc>
+          <w:tcPr>
+            <w:tcW w:type="dxa" w:w="3956"/>
+            <w:tcBorders>
+              <w:top w:val="single" w:color="7F8C99" w:sz="4"/>
+              <w:left w:val="single" w:color="7F8C99" w:sz="4"/>
+              <w:bottom w:val="single" w:color="7F8C99" w:sz="4"/>
+              <w:right w:val="single" w:color="7F8C99" w:sz="4"/>
+            </w:tcBorders>
+            <w:tcMar>
+              <w:top w:type="dxa" w:w="60"/>
+              <w:left w:type="dxa" w:w="90"/>
+              <w:bottom w:type="dxa" w:w="60"/>
+              <w:right w:type="dxa" w:w="90"/>
+            </w:tcMar>
+            <w:vAlign w:val="top"/>
+          </w:tcPr>
+          <w:p>
+            <w:pPr>
+              <w:spacing w:after="20" w:before="0"/>
+            </w:pPr>
+            <w:r>
+              <w:rPr>
+                <w:rFonts w:ascii="Arial" w:cs="Arial" w:eastAsia="Arial" w:hAnsi="Arial"/>
+                <w:sz w:val="18"/>
+                <w:szCs w:val="18"/>
+              </w:rPr>
+              <w:t xml:space="preserve">Dẫn chứng bằng trường đã triển khai, công văn của Sở, số liệu nghiên cứu; thừa nhận giới hạn, không hứa quá; thái độ chuyên nghiệp, tự tin.</w:t>
+            </w:r>
+          </w:p>
+        </w:tc>
+        <w:tc>
+          <w:tcPr>
+            <w:tcW w:type="dxa" w:w="1700"/>
+            <w:tcBorders>
+              <w:top w:val="single" w:color="7F8C99" w:sz="4"/>
+              <w:left w:val="single" w:color="7F8C99" w:sz="4"/>
+              <w:bottom w:val="single" w:color="7F8C99" w:sz="4"/>
+              <w:right w:val="single" w:color="7F8C99" w:sz="4"/>
+            </w:tcBorders>
+            <w:tcMar>
+              <w:top w:type="dxa" w:w="60"/>
+              <w:left w:type="dxa" w:w="90"/>
+              <w:bottom w:type="dxa" w:w="60"/>
+              <w:right w:type="dxa" w:w="90"/>
+            </w:tcMar>
+            <w:vAlign w:val="center"/>
+          </w:tcPr>
+          <w:p>
+            <w:pPr>
+              <w:spacing w:after="0" w:before="0"/>
+              <w:jc w:val="center"/>
+            </w:pPr>
+            <w:r>
+              <w:rPr>
+                <w:rFonts w:ascii="Arial" w:cs="Arial" w:eastAsia="Arial" w:hAnsi="Arial"/>
+                <w:sz w:val="20"/>
+                <w:szCs w:val="20"/>
+              </w:rPr>
+              <w:t xml:space="preserve">☐1  ☐2  ☐3  ☐4</w:t>
+            </w:r>
+          </w:p>
+        </w:tc>
+        <w:tc>
+          <w:tcPr>
+            <w:tcW w:type="dxa" w:w="1300"/>
+            <w:tcBorders>
+              <w:top w:val="single" w:color="7F8C99" w:sz="4"/>
+              <w:left w:val="single" w:color="7F8C99" w:sz="4"/>
+              <w:bottom w:val="single" w:color="7F8C99" w:sz="4"/>
+              <w:right w:val="single" w:color="7F8C99" w:sz="4"/>
+            </w:tcBorders>
+            <w:tcMar>
+              <w:top w:type="dxa" w:w="60"/>
+              <w:left w:type="dxa" w:w="90"/>
+              <w:bottom w:type="dxa" w:w="60"/>
+              <w:right w:type="dxa" w:w="90"/>
+            </w:tcMar>
+            <w:vAlign w:val="top"/>
+          </w:tcPr>
+          <w:p>
+            <w:pPr>
+              <w:spacing w:after="20" w:before="0"/>
+            </w:pPr>
+            <w:r>
+              <w:rPr>
+                <w:rFonts w:ascii="Arial" w:cs="Arial" w:eastAsia="Arial" w:hAnsi="Arial"/>
+                <w:sz w:val="21"/>
+                <w:szCs w:val="21"/>
+              </w:rPr>
+              <w:t xml:space="preserve"/>
             </w:r>
           </w:p>
         </w:tc>
@@ -5016,7 +5414,7 @@
         </w:trPr>
         <w:tc>
           <w:tcPr>
-            <w:tcW w:type="dxa" w:w="500"/>
+            <w:tcW w:type="dxa" w:w="650"/>
             <w:tcBorders>
               <w:top w:val="single" w:color="7F8C99" w:sz="4"/>
               <w:left w:val="single" w:color="7F8C99" w:sz="4"/>
@@ -5044,7 +5442,7 @@
                 <w:sz w:val="21"/>
                 <w:szCs w:val="21"/>
               </w:rPr>
-              <w:t xml:space="preserve">7</w:t>
+              <w:t xml:space="preserve">KN4</w:t>
             </w:r>
           </w:p>
         </w:tc>
@@ -5077,13 +5475,13 @@
                 <w:sz w:val="21"/>
                 <w:szCs w:val="21"/>
               </w:rPr>
-              <w:t xml:space="preserve">Khai thác nhu cầu</w:t>
-            </w:r>
-          </w:p>
-        </w:tc>
-        <w:tc>
-          <w:tcPr>
-            <w:tcW w:type="dxa" w:w="4106"/>
+              <w:t xml:space="preserve">Quan sát, kể chuyện</w:t>
+            </w:r>
+          </w:p>
+        </w:tc>
+        <w:tc>
+          <w:tcPr>
+            <w:tcW w:type="dxa" w:w="3956"/>
             <w:tcBorders>
               <w:top w:val="single" w:color="7F8C99" w:sz="4"/>
               <w:left w:val="single" w:color="7F8C99" w:sz="4"/>
@@ -5108,7 +5506,7 @@
                 <w:sz w:val="18"/>
                 <w:szCs w:val="18"/>
               </w:rPr>
-              <w:t xml:space="preserve">Chủ động hỏi về hiện trạng, mục tiêu, khó khăn của trường trước khi trình bày; dùng thông tin đó để chọn nội dung tư vấn.</w:t>
+              <w:t xml:space="preserve">Nhận ra tín hiệu, mối quan tâm của Hiệu trưởng và điều chỉnh nội dung; dùng câu chuyện thực tế (tiết học Buổi 2, giáo viên, học sinh trường bạn) thay vì liệt kê tính năng.</w:t>
             </w:r>
           </w:p>
         </w:tc>
@@ -5182,7 +5580,7 @@
         </w:trPr>
         <w:tc>
           <w:tcPr>
-            <w:tcW w:type="dxa" w:w="500"/>
+            <w:tcW w:type="dxa" w:w="650"/>
             <w:tcBorders>
               <w:top w:val="single" w:color="7F8C99" w:sz="4"/>
               <w:left w:val="single" w:color="7F8C99" w:sz="4"/>
@@ -5210,7 +5608,7 @@
                 <w:sz w:val="21"/>
                 <w:szCs w:val="21"/>
               </w:rPr>
-              <w:t xml:space="preserve">8</w:t>
+              <w:t xml:space="preserve">KN5</w:t>
             </w:r>
           </w:p>
         </w:tc>
@@ -5243,13 +5641,13 @@
                 <w:sz w:val="21"/>
                 <w:szCs w:val="21"/>
               </w:rPr>
-              <w:t xml:space="preserve">Xử lý từ chối</w:t>
-            </w:r>
-          </w:p>
-        </w:tc>
-        <w:tc>
-          <w:tcPr>
-            <w:tcW w:type="dxa" w:w="4106"/>
+              <w:t xml:space="preserve">Giải quyết vấn đề</w:t>
+            </w:r>
+          </w:p>
+        </w:tc>
+        <w:tc>
+          <w:tcPr>
+            <w:tcW w:type="dxa" w:w="3956"/>
             <w:tcBorders>
               <w:top w:val="single" w:color="7F8C99" w:sz="4"/>
               <w:left w:val="single" w:color="7F8C99" w:sz="4"/>
@@ -5274,173 +5672,7 @@
                 <w:sz w:val="18"/>
                 <w:szCs w:val="18"/>
               </w:rPr>
-              <w:t xml:space="preserve">Ghi nhận băn khoăn, không phản bác ngay; trả lời bằng thông tin đúng và dẫn chứng; kiểm tra lại khách đã yên tâm chưa.</w:t>
-            </w:r>
-          </w:p>
-        </w:tc>
-        <w:tc>
-          <w:tcPr>
-            <w:tcW w:type="dxa" w:w="1700"/>
-            <w:tcBorders>
-              <w:top w:val="single" w:color="7F8C99" w:sz="4"/>
-              <w:left w:val="single" w:color="7F8C99" w:sz="4"/>
-              <w:bottom w:val="single" w:color="7F8C99" w:sz="4"/>
-              <w:right w:val="single" w:color="7F8C99" w:sz="4"/>
-            </w:tcBorders>
-            <w:tcMar>
-              <w:top w:type="dxa" w:w="60"/>
-              <w:left w:type="dxa" w:w="90"/>
-              <w:bottom w:type="dxa" w:w="60"/>
-              <w:right w:type="dxa" w:w="90"/>
-            </w:tcMar>
-            <w:vAlign w:val="center"/>
-          </w:tcPr>
-          <w:p>
-            <w:pPr>
-              <w:spacing w:after="0" w:before="0"/>
-              <w:jc w:val="center"/>
-            </w:pPr>
-            <w:r>
-              <w:rPr>
-                <w:rFonts w:ascii="Arial" w:cs="Arial" w:eastAsia="Arial" w:hAnsi="Arial"/>
-                <w:sz w:val="20"/>
-                <w:szCs w:val="20"/>
-              </w:rPr>
-              <w:t xml:space="preserve">☐1  ☐2  ☐3  ☐4</w:t>
-            </w:r>
-          </w:p>
-        </w:tc>
-        <w:tc>
-          <w:tcPr>
-            <w:tcW w:type="dxa" w:w="1300"/>
-            <w:tcBorders>
-              <w:top w:val="single" w:color="7F8C99" w:sz="4"/>
-              <w:left w:val="single" w:color="7F8C99" w:sz="4"/>
-              <w:bottom w:val="single" w:color="7F8C99" w:sz="4"/>
-              <w:right w:val="single" w:color="7F8C99" w:sz="4"/>
-            </w:tcBorders>
-            <w:tcMar>
-              <w:top w:type="dxa" w:w="60"/>
-              <w:left w:type="dxa" w:w="90"/>
-              <w:bottom w:type="dxa" w:w="60"/>
-              <w:right w:type="dxa" w:w="90"/>
-            </w:tcMar>
-            <w:vAlign w:val="top"/>
-          </w:tcPr>
-          <w:p>
-            <w:pPr>
-              <w:spacing w:after="20" w:before="0"/>
-            </w:pPr>
-            <w:r>
-              <w:rPr>
-                <w:rFonts w:ascii="Arial" w:cs="Arial" w:eastAsia="Arial" w:hAnsi="Arial"/>
-                <w:sz w:val="21"/>
-                <w:szCs w:val="21"/>
-              </w:rPr>
-              <w:t xml:space="preserve"/>
-            </w:r>
-          </w:p>
-        </w:tc>
-      </w:tr>
-      <w:tr>
-        <w:trPr>
-          <w:cantSplit/>
-        </w:trPr>
-        <w:tc>
-          <w:tcPr>
-            <w:tcW w:type="dxa" w:w="500"/>
-            <w:tcBorders>
-              <w:top w:val="single" w:color="7F8C99" w:sz="4"/>
-              <w:left w:val="single" w:color="7F8C99" w:sz="4"/>
-              <w:bottom w:val="single" w:color="7F8C99" w:sz="4"/>
-              <w:right w:val="single" w:color="7F8C99" w:sz="4"/>
-            </w:tcBorders>
-            <w:tcMar>
-              <w:top w:type="dxa" w:w="60"/>
-              <w:left w:type="dxa" w:w="90"/>
-              <w:bottom w:type="dxa" w:w="60"/>
-              <w:right w:type="dxa" w:w="90"/>
-            </w:tcMar>
-            <w:vAlign w:val="top"/>
-          </w:tcPr>
-          <w:p>
-            <w:pPr>
-              <w:spacing w:after="20" w:before="0"/>
-              <w:jc w:val="center"/>
-            </w:pPr>
-            <w:r>
-              <w:rPr>
-                <w:rFonts w:ascii="Arial" w:cs="Arial" w:eastAsia="Arial" w:hAnsi="Arial"/>
-                <w:b/>
-                <w:bCs/>
-                <w:sz w:val="21"/>
-                <w:szCs w:val="21"/>
-              </w:rPr>
-              <w:t xml:space="preserve">9</w:t>
-            </w:r>
-          </w:p>
-        </w:tc>
-        <w:tc>
-          <w:tcPr>
-            <w:tcW w:type="dxa" w:w="2300"/>
-            <w:tcBorders>
-              <w:top w:val="single" w:color="7F8C99" w:sz="4"/>
-              <w:left w:val="single" w:color="7F8C99" w:sz="4"/>
-              <w:bottom w:val="single" w:color="7F8C99" w:sz="4"/>
-              <w:right w:val="single" w:color="7F8C99" w:sz="4"/>
-            </w:tcBorders>
-            <w:tcMar>
-              <w:top w:type="dxa" w:w="60"/>
-              <w:left w:type="dxa" w:w="90"/>
-              <w:bottom w:type="dxa" w:w="60"/>
-              <w:right w:type="dxa" w:w="90"/>
-            </w:tcMar>
-            <w:vAlign w:val="top"/>
-          </w:tcPr>
-          <w:p>
-            <w:pPr>
-              <w:spacing w:after="20" w:before="0"/>
-            </w:pPr>
-            <w:r>
-              <w:rPr>
-                <w:rFonts w:ascii="Arial" w:cs="Arial" w:eastAsia="Arial" w:hAnsi="Arial"/>
-                <w:b/>
-                <w:bCs/>
-                <w:sz w:val="21"/>
-                <w:szCs w:val="21"/>
-              </w:rPr>
-              <w:t xml:space="preserve">Chốt bước tiếp theo</w:t>
-            </w:r>
-          </w:p>
-        </w:tc>
-        <w:tc>
-          <w:tcPr>
-            <w:tcW w:type="dxa" w:w="4106"/>
-            <w:tcBorders>
-              <w:top w:val="single" w:color="7F8C99" w:sz="4"/>
-              <w:left w:val="single" w:color="7F8C99" w:sz="4"/>
-              <w:bottom w:val="single" w:color="7F8C99" w:sz="4"/>
-              <w:right w:val="single" w:color="7F8C99" w:sz="4"/>
-            </w:tcBorders>
-            <w:tcMar>
-              <w:top w:type="dxa" w:w="60"/>
-              <w:left w:type="dxa" w:w="90"/>
-              <w:bottom w:type="dxa" w:w="60"/>
-              <w:right w:type="dxa" w:w="90"/>
-            </w:tcMar>
-            <w:vAlign w:val="top"/>
-          </w:tcPr>
-          <w:p>
-            <w:pPr>
-              <w:spacing w:after="20" w:before="0"/>
-            </w:pPr>
-            <w:r>
-              <w:rPr>
-                <w:rFonts w:ascii="Arial" w:cs="Arial" w:eastAsia="Arial" w:hAnsi="Arial"/>
-                <w:sz w:val="18"/>
-                <w:szCs w:val="18"/>
-              </w:rPr>
-              <w:t xml:space="preserve">Đề xuất được bước tiếp cụ thể (khảo sát phòng máy, dự tiết học mẫu, demo cho tổ chuyên môn…) kèm thời gian; không kết thúc bằng "dạ em gửi tài liệu".</w:t>
+              <w:t xml:space="preserve">Với mỗi khó khăn (phòng máy cũ, ngân sách, giáo viên lớn tuổi, học sinh dùng máy sai mục đích) đưa ra phương án cụ thể, khả thi; khi khách do dự thì đề xuất bước tiếp theo nhỏ, rõ ràng.</w:t>
             </w:r>
           </w:p>
         </w:tc>
@@ -5655,7 +5887,7 @@
                 <w:sz w:val="21"/>
                 <w:szCs w:val="21"/>
               </w:rPr>
-              <w:t xml:space="preserve">Đếm số tiêu chí</w:t>
+              <w:t xml:space="preserve">I. Chuyên môn</w:t>
             </w:r>
           </w:p>
         </w:tc>
@@ -5678,15 +5910,28 @@
           </w:tcPr>
           <w:p>
             <w:pPr>
-              <w:spacing w:after="20" w:before="0"/>
-            </w:pPr>
-            <w:r>
-              <w:rPr>
-                <w:rFonts w:ascii="Arial" w:cs="Arial" w:eastAsia="Arial" w:hAnsi="Arial"/>
-                <w:sz w:val="21"/>
-                <w:szCs w:val="21"/>
-              </w:rPr>
-              <w:t xml:space="preserve">Điểm 1: ……     Điểm 2: ……     Điểm 3–4: ……</w:t>
+              <w:spacing w:after="80" w:before="40"/>
+            </w:pPr>
+            <w:r>
+              <w:rPr>
+                <w:rFonts w:ascii="Arial" w:cs="Arial" w:eastAsia="Arial" w:hAnsi="Arial"/>
+                <w:sz w:val="21"/>
+                <w:szCs w:val="21"/>
+              </w:rPr>
+              <w:t xml:space="preserve">Số điểm 1: ……   Số điểm 2: ……</w:t>
+            </w:r>
+          </w:p>
+          <w:p>
+            <w:pPr>
+              <w:spacing w:after="80" w:before="40"/>
+            </w:pPr>
+            <w:r>
+              <w:rPr>
+                <w:rFonts w:ascii="Arial" w:cs="Arial" w:eastAsia="Arial" w:hAnsi="Arial"/>
+                <w:sz w:val="21"/>
+                <w:szCs w:val="21"/>
+              </w:rPr>
+              <w:t xml:space="preserve">☐ Đạt     ☐ Đạt có điều kiện     ☐ Chưa đạt</w:t>
             </w:r>
           </w:p>
         </w:tc>
@@ -5725,7 +5970,90 @@
                 <w:sz w:val="21"/>
                 <w:szCs w:val="21"/>
               </w:rPr>
-              <w:t xml:space="preserve">KẾT QUẢ</w:t>
+              <w:t xml:space="preserve">II. Kỹ năng mềm</w:t>
+            </w:r>
+          </w:p>
+        </w:tc>
+        <w:tc>
+          <w:tcPr>
+            <w:tcW w:type="dxa" w:w="6306"/>
+            <w:tcBorders>
+              <w:top w:val="single" w:color="7F8C99" w:sz="4"/>
+              <w:left w:val="single" w:color="7F8C99" w:sz="4"/>
+              <w:bottom w:val="single" w:color="7F8C99" w:sz="4"/>
+              <w:right w:val="single" w:color="7F8C99" w:sz="4"/>
+            </w:tcBorders>
+            <w:tcMar>
+              <w:top w:type="dxa" w:w="60"/>
+              <w:left w:type="dxa" w:w="90"/>
+              <w:bottom w:type="dxa" w:w="60"/>
+              <w:right w:type="dxa" w:w="90"/>
+            </w:tcMar>
+            <w:vAlign w:val="top"/>
+          </w:tcPr>
+          <w:p>
+            <w:pPr>
+              <w:spacing w:after="80" w:before="40"/>
+            </w:pPr>
+            <w:r>
+              <w:rPr>
+                <w:rFonts w:ascii="Arial" w:cs="Arial" w:eastAsia="Arial" w:hAnsi="Arial"/>
+                <w:sz w:val="21"/>
+                <w:szCs w:val="21"/>
+              </w:rPr>
+              <w:t xml:space="preserve">Số điểm 1: ……   Số điểm 2: ……</w:t>
+            </w:r>
+          </w:p>
+          <w:p>
+            <w:pPr>
+              <w:spacing w:after="80" w:before="40"/>
+            </w:pPr>
+            <w:r>
+              <w:rPr>
+                <w:rFonts w:ascii="Arial" w:cs="Arial" w:eastAsia="Arial" w:hAnsi="Arial"/>
+                <w:sz w:val="21"/>
+                <w:szCs w:val="21"/>
+              </w:rPr>
+              <w:t xml:space="preserve">☐ Đạt     ☐ Đạt có điều kiện     ☐ Chưa đạt</w:t>
+            </w:r>
+          </w:p>
+        </w:tc>
+      </w:tr>
+      <w:tr>
+        <w:trPr>
+          <w:cantSplit/>
+        </w:trPr>
+        <w:tc>
+          <w:tcPr>
+            <w:tcW w:type="dxa" w:w="3600"/>
+            <w:tcBorders>
+              <w:top w:val="single" w:color="7F8C99" w:sz="4"/>
+              <w:left w:val="single" w:color="7F8C99" w:sz="4"/>
+              <w:bottom w:val="single" w:color="7F8C99" w:sz="4"/>
+              <w:right w:val="single" w:color="7F8C99" w:sz="4"/>
+            </w:tcBorders>
+            <w:shd w:fill="E8EEF4" w:color="auto" w:val="clear"/>
+            <w:tcMar>
+              <w:top w:type="dxa" w:w="60"/>
+              <w:left w:type="dxa" w:w="90"/>
+              <w:bottom w:type="dxa" w:w="60"/>
+              <w:right w:type="dxa" w:w="90"/>
+            </w:tcMar>
+            <w:vAlign w:val="top"/>
+          </w:tcPr>
+          <w:p>
+            <w:pPr>
+              <w:spacing w:after="20" w:before="0"/>
+            </w:pPr>
+            <w:r>
+              <w:rPr>
+                <w:rFonts w:ascii="Arial" w:cs="Arial" w:eastAsia="Arial" w:hAnsi="Arial"/>
+                <w:b/>
+                <w:bCs/>
+                <w:sz w:val="21"/>
+                <w:szCs w:val="21"/>
+              </w:rPr>
+              <w:t xml:space="preserve">KẾT QUẢ CHUNG (nhóm thấp hơn)</w:t>
             </w:r>
           </w:p>
         </w:tc>
@@ -6006,6 +6334,594 @@
                 <w:szCs w:val="21"/>
               </w:rPr>
               <w:t xml:space="preserve">Tiêu chí cần chấm lại: ………………………………………………………………………………</w:t>
+            </w:r>
+          </w:p>
+        </w:tc>
+      </w:tr>
+    </w:tbl>
+    <w:p>
+      <w:pPr>
+        <w:spacing w:after="80" w:before="40"/>
+      </w:pPr>
+      <w:r>
+        <w:rPr>
+          <w:rFonts w:ascii="Arial" w:cs="Arial" w:eastAsia="Arial" w:hAnsi="Arial"/>
+          <w:sz w:val="21"/>
+          <w:szCs w:val="21"/>
+        </w:rPr>
+        <w:t xml:space="preserve"/>
+      </w:r>
+    </w:p>
+    <w:p>
+      <w:pPr>
+        <w:keepNext/>
+        <w:spacing w:after="80" w:before="40"/>
+      </w:pPr>
+      <w:r>
+        <w:rPr>
+          <w:rFonts w:ascii="Arial" w:cs="Arial" w:eastAsia="Arial" w:hAnsi="Arial"/>
+          <w:b/>
+          <w:bCs/>
+          <w:color w:val="1F4E79"/>
+          <w:sz w:val="21"/>
+          <w:szCs w:val="21"/>
+        </w:rPr>
+        <w:t xml:space="preserve">Chứng chỉ bắt buộc </w:t>
+      </w:r>
+      <w:r>
+        <w:rPr>
+          <w:rFonts w:ascii="Arial" w:cs="Arial" w:eastAsia="Arial" w:hAnsi="Arial"/>
+          <w:i/>
+          <w:iCs/>
+          <w:sz w:val="18"/>
+          <w:szCs w:val="18"/>
+        </w:rPr>
+        <w:t xml:space="preserve">(hỏi ngoài role-play – ghi nhận cho báo cáo sau đào tạo, không tính vào kết quả)</w:t>
+      </w:r>
+    </w:p>
+    <w:tbl>
+      <w:tblPr>
+        <w:tblW w:type="dxa" w:w="9906"/>
+        <w:tblBorders>
+          <w:top w:val="single" w:color="auto" w:sz="4"/>
+          <w:left w:val="single" w:color="auto" w:sz="4"/>
+          <w:bottom w:val="single" w:color="auto" w:sz="4"/>
+          <w:right w:val="single" w:color="auto" w:sz="4"/>
+          <w:insideH w:val="single" w:color="auto" w:sz="4"/>
+          <w:insideV w:val="single" w:color="auto" w:sz="4"/>
+        </w:tblBorders>
+      </w:tblPr>
+      <w:tblGrid>
+        <w:gridCol w:w="3300"/>
+        <w:gridCol w:w="3306"/>
+        <w:gridCol w:w="1800"/>
+        <w:gridCol w:w="1500"/>
+      </w:tblGrid>
+      <w:tr>
+        <w:trPr>
+          <w:cantSplit/>
+          <w:tblHeader/>
+        </w:trPr>
+        <w:tc>
+          <w:tcPr>
+            <w:tcW w:type="dxa" w:w="3300"/>
+            <w:tcBorders>
+              <w:top w:val="single" w:color="7F8C99" w:sz="4"/>
+              <w:left w:val="single" w:color="7F8C99" w:sz="4"/>
+              <w:bottom w:val="single" w:color="7F8C99" w:sz="4"/>
+              <w:right w:val="single" w:color="7F8C99" w:sz="4"/>
+            </w:tcBorders>
+            <w:shd w:fill="E8EEF4" w:color="auto" w:val="clear"/>
+            <w:tcMar>
+              <w:top w:type="dxa" w:w="60"/>
+              <w:left w:type="dxa" w:w="90"/>
+              <w:bottom w:type="dxa" w:w="60"/>
+              <w:right w:type="dxa" w:w="90"/>
+            </w:tcMar>
+            <w:vAlign w:val="top"/>
+          </w:tcPr>
+          <w:p>
+            <w:pPr>
+              <w:spacing w:after="20" w:before="0"/>
+            </w:pPr>
+            <w:r>
+              <w:rPr>
+                <w:rFonts w:ascii="Arial" w:cs="Arial" w:eastAsia="Arial" w:hAnsi="Arial"/>
+                <w:b/>
+                <w:bCs/>
+                <w:sz w:val="21"/>
+                <w:szCs w:val="21"/>
+              </w:rPr>
+              <w:t xml:space="preserve">Chứng chỉ</w:t>
+            </w:r>
+          </w:p>
+        </w:tc>
+        <w:tc>
+          <w:tcPr>
+            <w:tcW w:type="dxa" w:w="3306"/>
+            <w:tcBorders>
+              <w:top w:val="single" w:color="7F8C99" w:sz="4"/>
+              <w:left w:val="single" w:color="7F8C99" w:sz="4"/>
+              <w:bottom w:val="single" w:color="7F8C99" w:sz="4"/>
+              <w:right w:val="single" w:color="7F8C99" w:sz="4"/>
+            </w:tcBorders>
+            <w:shd w:fill="E8EEF4" w:color="auto" w:val="clear"/>
+            <w:tcMar>
+              <w:top w:type="dxa" w:w="60"/>
+              <w:left w:type="dxa" w:w="90"/>
+              <w:bottom w:type="dxa" w:w="60"/>
+              <w:right w:type="dxa" w:w="90"/>
+            </w:tcMar>
+            <w:vAlign w:val="top"/>
+          </w:tcPr>
+          <w:p>
+            <w:pPr>
+              <w:spacing w:after="20" w:before="0"/>
+            </w:pPr>
+            <w:r>
+              <w:rPr>
+                <w:rFonts w:ascii="Arial" w:cs="Arial" w:eastAsia="Arial" w:hAnsi="Arial"/>
+                <w:b/>
+                <w:bCs/>
+                <w:sz w:val="21"/>
+                <w:szCs w:val="21"/>
+              </w:rPr>
+              <w:t xml:space="preserve">Tình trạng</w:t>
+            </w:r>
+          </w:p>
+        </w:tc>
+        <w:tc>
+          <w:tcPr>
+            <w:tcW w:type="dxa" w:w="1800"/>
+            <w:tcBorders>
+              <w:top w:val="single" w:color="7F8C99" w:sz="4"/>
+              <w:left w:val="single" w:color="7F8C99" w:sz="4"/>
+              <w:bottom w:val="single" w:color="7F8C99" w:sz="4"/>
+              <w:right w:val="single" w:color="7F8C99" w:sz="4"/>
+            </w:tcBorders>
+            <w:shd w:fill="E8EEF4" w:color="auto" w:val="clear"/>
+            <w:tcMar>
+              <w:top w:type="dxa" w:w="60"/>
+              <w:left w:type="dxa" w:w="90"/>
+              <w:bottom w:type="dxa" w:w="60"/>
+              <w:right w:type="dxa" w:w="90"/>
+            </w:tcMar>
+            <w:vAlign w:val="top"/>
+          </w:tcPr>
+          <w:p>
+            <w:pPr>
+              <w:spacing w:after="20" w:before="0"/>
+            </w:pPr>
+            <w:r>
+              <w:rPr>
+                <w:rFonts w:ascii="Arial" w:cs="Arial" w:eastAsia="Arial" w:hAnsi="Arial"/>
+                <w:b/>
+                <w:bCs/>
+                <w:sz w:val="21"/>
+                <w:szCs w:val="21"/>
+              </w:rPr>
+              <w:t xml:space="preserve">Ngày cấp / dự kiến</w:t>
+            </w:r>
+          </w:p>
+        </w:tc>
+        <w:tc>
+          <w:tcPr>
+            <w:tcW w:type="dxa" w:w="1500"/>
+            <w:tcBorders>
+              <w:top w:val="single" w:color="7F8C99" w:sz="4"/>
+              <w:left w:val="single" w:color="7F8C99" w:sz="4"/>
+              <w:bottom w:val="single" w:color="7F8C99" w:sz="4"/>
+              <w:right w:val="single" w:color="7F8C99" w:sz="4"/>
+            </w:tcBorders>
+            <w:shd w:fill="E8EEF4" w:color="auto" w:val="clear"/>
+            <w:tcMar>
+              <w:top w:type="dxa" w:w="60"/>
+              <w:left w:type="dxa" w:w="90"/>
+              <w:bottom w:type="dxa" w:w="60"/>
+              <w:right w:type="dxa" w:w="90"/>
+            </w:tcMar>
+            <w:vAlign w:val="top"/>
+          </w:tcPr>
+          <w:p>
+            <w:pPr>
+              <w:spacing w:after="20" w:before="0"/>
+            </w:pPr>
+            <w:r>
+              <w:rPr>
+                <w:rFonts w:ascii="Arial" w:cs="Arial" w:eastAsia="Arial" w:hAnsi="Arial"/>
+                <w:b/>
+                <w:bCs/>
+                <w:sz w:val="21"/>
+                <w:szCs w:val="21"/>
+              </w:rPr>
+              <w:t xml:space="preserve">Minh chứng</w:t>
+            </w:r>
+          </w:p>
+        </w:tc>
+      </w:tr>
+      <w:tr>
+        <w:trPr>
+          <w:cantSplit/>
+        </w:trPr>
+        <w:tc>
+          <w:tcPr>
+            <w:tcW w:type="dxa" w:w="3300"/>
+            <w:tcBorders>
+              <w:top w:val="single" w:color="7F8C99" w:sz="4"/>
+              <w:left w:val="single" w:color="7F8C99" w:sz="4"/>
+              <w:bottom w:val="single" w:color="7F8C99" w:sz="4"/>
+              <w:right w:val="single" w:color="7F8C99" w:sz="4"/>
+            </w:tcBorders>
+            <w:tcMar>
+              <w:top w:type="dxa" w:w="60"/>
+              <w:left w:type="dxa" w:w="90"/>
+              <w:bottom w:type="dxa" w:w="60"/>
+              <w:right w:type="dxa" w:w="90"/>
+            </w:tcMar>
+            <w:vAlign w:val="top"/>
+          </w:tcPr>
+          <w:p>
+            <w:pPr>
+              <w:spacing w:after="20" w:before="0"/>
+            </w:pPr>
+            <w:r>
+              <w:rPr>
+                <w:rFonts w:ascii="Arial" w:cs="Arial" w:eastAsia="Arial" w:hAnsi="Arial"/>
+                <w:sz w:val="21"/>
+                <w:szCs w:val="21"/>
+              </w:rPr>
+              <w:t xml:space="preserve">Sales Credential</w:t>
+            </w:r>
+          </w:p>
+        </w:tc>
+        <w:tc>
+          <w:tcPr>
+            <w:tcW w:type="dxa" w:w="3306"/>
+            <w:tcBorders>
+              <w:top w:val="single" w:color="7F8C99" w:sz="4"/>
+              <w:left w:val="single" w:color="7F8C99" w:sz="4"/>
+              <w:bottom w:val="single" w:color="7F8C99" w:sz="4"/>
+              <w:right w:val="single" w:color="7F8C99" w:sz="4"/>
+            </w:tcBorders>
+            <w:tcMar>
+              <w:top w:type="dxa" w:w="60"/>
+              <w:left w:type="dxa" w:w="90"/>
+              <w:bottom w:type="dxa" w:w="60"/>
+              <w:right w:type="dxa" w:w="90"/>
+            </w:tcMar>
+            <w:vAlign w:val="top"/>
+          </w:tcPr>
+          <w:p>
+            <w:pPr>
+              <w:spacing w:after="20" w:before="0"/>
+            </w:pPr>
+            <w:r>
+              <w:rPr>
+                <w:rFonts w:ascii="Arial" w:cs="Arial" w:eastAsia="Arial" w:hAnsi="Arial"/>
+                <w:sz w:val="19"/>
+                <w:szCs w:val="19"/>
+              </w:rPr>
+              <w:t xml:space="preserve">☐ Đã có   ☐ Đang học   ☐ Chưa có</w:t>
+            </w:r>
+          </w:p>
+        </w:tc>
+        <w:tc>
+          <w:tcPr>
+            <w:tcW w:type="dxa" w:w="1800"/>
+            <w:tcBorders>
+              <w:top w:val="single" w:color="7F8C99" w:sz="4"/>
+              <w:left w:val="single" w:color="7F8C99" w:sz="4"/>
+              <w:bottom w:val="single" w:color="7F8C99" w:sz="4"/>
+              <w:right w:val="single" w:color="7F8C99" w:sz="4"/>
+            </w:tcBorders>
+            <w:tcMar>
+              <w:top w:type="dxa" w:w="60"/>
+              <w:left w:type="dxa" w:w="90"/>
+              <w:bottom w:type="dxa" w:w="60"/>
+              <w:right w:type="dxa" w:w="90"/>
+            </w:tcMar>
+            <w:vAlign w:val="top"/>
+          </w:tcPr>
+          <w:p>
+            <w:pPr>
+              <w:spacing w:after="20" w:before="0"/>
+            </w:pPr>
+            <w:r>
+              <w:rPr>
+                <w:rFonts w:ascii="Arial" w:cs="Arial" w:eastAsia="Arial" w:hAnsi="Arial"/>
+                <w:sz w:val="21"/>
+                <w:szCs w:val="21"/>
+              </w:rPr>
+              <w:t xml:space="preserve">……/……/……</w:t>
+            </w:r>
+          </w:p>
+        </w:tc>
+        <w:tc>
+          <w:tcPr>
+            <w:tcW w:type="dxa" w:w="1500"/>
+            <w:tcBorders>
+              <w:top w:val="single" w:color="7F8C99" w:sz="4"/>
+              <w:left w:val="single" w:color="7F8C99" w:sz="4"/>
+              <w:bottom w:val="single" w:color="7F8C99" w:sz="4"/>
+              <w:right w:val="single" w:color="7F8C99" w:sz="4"/>
+            </w:tcBorders>
+            <w:tcMar>
+              <w:top w:type="dxa" w:w="60"/>
+              <w:left w:type="dxa" w:w="90"/>
+              <w:bottom w:type="dxa" w:w="60"/>
+              <w:right w:type="dxa" w:w="90"/>
+            </w:tcMar>
+            <w:vAlign w:val="top"/>
+          </w:tcPr>
+          <w:p>
+            <w:pPr>
+              <w:spacing w:after="20" w:before="0"/>
+            </w:pPr>
+            <w:r>
+              <w:rPr>
+                <w:rFonts w:ascii="Arial" w:cs="Arial" w:eastAsia="Arial" w:hAnsi="Arial"/>
+                <w:sz w:val="19"/>
+                <w:szCs w:val="19"/>
+              </w:rPr>
+              <w:t xml:space="preserve">☐ Đã xem</w:t>
+            </w:r>
+          </w:p>
+        </w:tc>
+      </w:tr>
+      <w:tr>
+        <w:trPr>
+          <w:cantSplit/>
+        </w:trPr>
+        <w:tc>
+          <w:tcPr>
+            <w:tcW w:type="dxa" w:w="3300"/>
+            <w:tcBorders>
+              <w:top w:val="single" w:color="7F8C99" w:sz="4"/>
+              <w:left w:val="single" w:color="7F8C99" w:sz="4"/>
+              <w:bottom w:val="single" w:color="7F8C99" w:sz="4"/>
+              <w:right w:val="single" w:color="7F8C99" w:sz="4"/>
+            </w:tcBorders>
+            <w:tcMar>
+              <w:top w:type="dxa" w:w="60"/>
+              <w:left w:type="dxa" w:w="90"/>
+              <w:bottom w:type="dxa" w:w="60"/>
+              <w:right w:type="dxa" w:w="90"/>
+            </w:tcMar>
+            <w:vAlign w:val="top"/>
+          </w:tcPr>
+          <w:p>
+            <w:pPr>
+              <w:spacing w:after="20" w:before="0"/>
+            </w:pPr>
+            <w:r>
+              <w:rPr>
+                <w:rFonts w:ascii="Arial" w:cs="Arial" w:eastAsia="Arial" w:hAnsi="Arial"/>
+                <w:sz w:val="21"/>
+                <w:szCs w:val="21"/>
+              </w:rPr>
+              <w:t xml:space="preserve">Chromebook for Educator</w:t>
+            </w:r>
+          </w:p>
+        </w:tc>
+        <w:tc>
+          <w:tcPr>
+            <w:tcW w:type="dxa" w:w="3306"/>
+            <w:tcBorders>
+              <w:top w:val="single" w:color="7F8C99" w:sz="4"/>
+              <w:left w:val="single" w:color="7F8C99" w:sz="4"/>
+              <w:bottom w:val="single" w:color="7F8C99" w:sz="4"/>
+              <w:right w:val="single" w:color="7F8C99" w:sz="4"/>
+            </w:tcBorders>
+            <w:tcMar>
+              <w:top w:type="dxa" w:w="60"/>
+              <w:left w:type="dxa" w:w="90"/>
+              <w:bottom w:type="dxa" w:w="60"/>
+              <w:right w:type="dxa" w:w="90"/>
+            </w:tcMar>
+            <w:vAlign w:val="top"/>
+          </w:tcPr>
+          <w:p>
+            <w:pPr>
+              <w:spacing w:after="20" w:before="0"/>
+            </w:pPr>
+            <w:r>
+              <w:rPr>
+                <w:rFonts w:ascii="Arial" w:cs="Arial" w:eastAsia="Arial" w:hAnsi="Arial"/>
+                <w:sz w:val="19"/>
+                <w:szCs w:val="19"/>
+              </w:rPr>
+              <w:t xml:space="preserve">☐ Đã có   ☐ Đang học   ☐ Chưa có</w:t>
+            </w:r>
+          </w:p>
+        </w:tc>
+        <w:tc>
+          <w:tcPr>
+            <w:tcW w:type="dxa" w:w="1800"/>
+            <w:tcBorders>
+              <w:top w:val="single" w:color="7F8C99" w:sz="4"/>
+              <w:left w:val="single" w:color="7F8C99" w:sz="4"/>
+              <w:bottom w:val="single" w:color="7F8C99" w:sz="4"/>
+              <w:right w:val="single" w:color="7F8C99" w:sz="4"/>
+            </w:tcBorders>
+            <w:tcMar>
+              <w:top w:type="dxa" w:w="60"/>
+              <w:left w:type="dxa" w:w="90"/>
+              <w:bottom w:type="dxa" w:w="60"/>
+              <w:right w:type="dxa" w:w="90"/>
+            </w:tcMar>
+            <w:vAlign w:val="top"/>
+          </w:tcPr>
+          <w:p>
+            <w:pPr>
+              <w:spacing w:after="20" w:before="0"/>
+            </w:pPr>
+            <w:r>
+              <w:rPr>
+                <w:rFonts w:ascii="Arial" w:cs="Arial" w:eastAsia="Arial" w:hAnsi="Arial"/>
+                <w:sz w:val="21"/>
+                <w:szCs w:val="21"/>
+              </w:rPr>
+              <w:t xml:space="preserve">……/……/……</w:t>
+            </w:r>
+          </w:p>
+        </w:tc>
+        <w:tc>
+          <w:tcPr>
+            <w:tcW w:type="dxa" w:w="1500"/>
+            <w:tcBorders>
+              <w:top w:val="single" w:color="7F8C99" w:sz="4"/>
+              <w:left w:val="single" w:color="7F8C99" w:sz="4"/>
+              <w:bottom w:val="single" w:color="7F8C99" w:sz="4"/>
+              <w:right w:val="single" w:color="7F8C99" w:sz="4"/>
+            </w:tcBorders>
+            <w:tcMar>
+              <w:top w:type="dxa" w:w="60"/>
+              <w:left w:type="dxa" w:w="90"/>
+              <w:bottom w:type="dxa" w:w="60"/>
+              <w:right w:type="dxa" w:w="90"/>
+            </w:tcMar>
+            <w:vAlign w:val="top"/>
+          </w:tcPr>
+          <w:p>
+            <w:pPr>
+              <w:spacing w:after="20" w:before="0"/>
+            </w:pPr>
+            <w:r>
+              <w:rPr>
+                <w:rFonts w:ascii="Arial" w:cs="Arial" w:eastAsia="Arial" w:hAnsi="Arial"/>
+                <w:sz w:val="19"/>
+                <w:szCs w:val="19"/>
+              </w:rPr>
+              <w:t xml:space="preserve">☐ Đã xem</w:t>
+            </w:r>
+          </w:p>
+        </w:tc>
+      </w:tr>
+      <w:tr>
+        <w:trPr>
+          <w:cantSplit/>
+        </w:trPr>
+        <w:tc>
+          <w:tcPr>
+            <w:tcW w:type="dxa" w:w="3300"/>
+            <w:tcBorders>
+              <w:top w:val="single" w:color="7F8C99" w:sz="4"/>
+              <w:left w:val="single" w:color="7F8C99" w:sz="4"/>
+              <w:bottom w:val="single" w:color="7F8C99" w:sz="4"/>
+              <w:right w:val="single" w:color="7F8C99" w:sz="4"/>
+            </w:tcBorders>
+            <w:tcMar>
+              <w:top w:type="dxa" w:w="60"/>
+              <w:left w:type="dxa" w:w="90"/>
+              <w:bottom w:type="dxa" w:w="60"/>
+              <w:right w:type="dxa" w:w="90"/>
+            </w:tcMar>
+            <w:vAlign w:val="top"/>
+          </w:tcPr>
+          <w:p>
+            <w:pPr>
+              <w:spacing w:after="20" w:before="0"/>
+            </w:pPr>
+            <w:r>
+              <w:rPr>
+                <w:rFonts w:ascii="Arial" w:cs="Arial" w:eastAsia="Arial" w:hAnsi="Arial"/>
+                <w:sz w:val="21"/>
+                <w:szCs w:val="21"/>
+              </w:rPr>
+              <w:t xml:space="preserve">Google Certified Educator Level 1</w:t>
+            </w:r>
+          </w:p>
+        </w:tc>
+        <w:tc>
+          <w:tcPr>
+            <w:tcW w:type="dxa" w:w="3306"/>
+            <w:tcBorders>
+              <w:top w:val="single" w:color="7F8C99" w:sz="4"/>
+              <w:left w:val="single" w:color="7F8C99" w:sz="4"/>
+              <w:bottom w:val="single" w:color="7F8C99" w:sz="4"/>
+              <w:right w:val="single" w:color="7F8C99" w:sz="4"/>
+            </w:tcBorders>
+            <w:tcMar>
+              <w:top w:type="dxa" w:w="60"/>
+              <w:left w:type="dxa" w:w="90"/>
+              <w:bottom w:type="dxa" w:w="60"/>
+              <w:right w:type="dxa" w:w="90"/>
+            </w:tcMar>
+            <w:vAlign w:val="top"/>
+          </w:tcPr>
+          <w:p>
+            <w:pPr>
+              <w:spacing w:after="20" w:before="0"/>
+            </w:pPr>
+            <w:r>
+              <w:rPr>
+                <w:rFonts w:ascii="Arial" w:cs="Arial" w:eastAsia="Arial" w:hAnsi="Arial"/>
+                <w:sz w:val="19"/>
+                <w:szCs w:val="19"/>
+              </w:rPr>
+              <w:t xml:space="preserve">☐ Đã có   ☐ Đang học   ☐ Chưa có</w:t>
+            </w:r>
+          </w:p>
+        </w:tc>
+        <w:tc>
+          <w:tcPr>
+            <w:tcW w:type="dxa" w:w="1800"/>
+            <w:tcBorders>
+              <w:top w:val="single" w:color="7F8C99" w:sz="4"/>
+              <w:left w:val="single" w:color="7F8C99" w:sz="4"/>
+              <w:bottom w:val="single" w:color="7F8C99" w:sz="4"/>
+              <w:right w:val="single" w:color="7F8C99" w:sz="4"/>
+            </w:tcBorders>
+            <w:tcMar>
+              <w:top w:type="dxa" w:w="60"/>
+              <w:left w:type="dxa" w:w="90"/>
+              <w:bottom w:type="dxa" w:w="60"/>
+              <w:right w:type="dxa" w:w="90"/>
+            </w:tcMar>
+            <w:vAlign w:val="top"/>
+          </w:tcPr>
+          <w:p>
+            <w:pPr>
+              <w:spacing w:after="20" w:before="0"/>
+            </w:pPr>
+            <w:r>
+              <w:rPr>
+                <w:rFonts w:ascii="Arial" w:cs="Arial" w:eastAsia="Arial" w:hAnsi="Arial"/>
+                <w:sz w:val="21"/>
+                <w:szCs w:val="21"/>
+              </w:rPr>
+              <w:t xml:space="preserve">……/……/……</w:t>
+            </w:r>
+          </w:p>
+        </w:tc>
+        <w:tc>
+          <w:tcPr>
+            <w:tcW w:type="dxa" w:w="1500"/>
+            <w:tcBorders>
+              <w:top w:val="single" w:color="7F8C99" w:sz="4"/>
+              <w:left w:val="single" w:color="7F8C99" w:sz="4"/>
+              <w:bottom w:val="single" w:color="7F8C99" w:sz="4"/>
+              <w:right w:val="single" w:color="7F8C99" w:sz="4"/>
+            </w:tcBorders>
+            <w:tcMar>
+              <w:top w:type="dxa" w:w="60"/>
+              <w:left w:type="dxa" w:w="90"/>
+              <w:bottom w:type="dxa" w:w="60"/>
+              <w:right w:type="dxa" w:w="90"/>
+            </w:tcMar>
+            <w:vAlign w:val="top"/>
+          </w:tcPr>
+          <w:p>
+            <w:pPr>
+              <w:spacing w:after="20" w:before="0"/>
+            </w:pPr>
+            <w:r>
+              <w:rPr>
+                <w:rFonts w:ascii="Arial" w:cs="Arial" w:eastAsia="Arial" w:hAnsi="Arial"/>
+                <w:sz w:val="19"/>
+                <w:szCs w:val="19"/>
+              </w:rPr>
+              <w:t xml:space="preserve">☐ Đã xem</w:t>
             </w:r>
           </w:p>
         </w:tc>

</xml_diff>